<commit_message>
backup and restore added
</commit_message>
<xml_diff>
--- a/docs/LifePilot_Project_Guide.docx
+++ b/docs/LifePilot_Project_Guide.docx
@@ -193,6 +193,16 @@
       </w:pPr>
       <w:hyperlink w:anchor="section_14" w:history="1">
         <w:r>
+          <w:t xml:space="preserve">12A. Backup &amp; Restore V1</w:t>
+        </w:r>
+      </w:hyperlink>
+    </w:p>
+    <w:p>
+      <w:pPr>
+        <w:pStyle w:val="Toc"/>
+      </w:pPr>
+      <w:hyperlink w:anchor="section_15" w:history="1">
+        <w:r>
           <w:t xml:space="preserve">13. Testing</w:t>
         </w:r>
       </w:hyperlink>
@@ -201,7 +211,7 @@
       <w:pPr>
         <w:pStyle w:val="Toc"/>
       </w:pPr>
-      <w:hyperlink w:anchor="section_15" w:history="1">
+      <w:hyperlink w:anchor="section_16" w:history="1">
         <w:r>
           <w:t xml:space="preserve">14. Development Environment</w:t>
         </w:r>
@@ -211,7 +221,7 @@
       <w:pPr>
         <w:pStyle w:val="Toc"/>
       </w:pPr>
-      <w:hyperlink w:anchor="section_16" w:history="1">
+      <w:hyperlink w:anchor="section_17" w:history="1">
         <w:r>
           <w:t xml:space="preserve">15. Git Workflow</w:t>
         </w:r>
@@ -221,7 +231,7 @@
       <w:pPr>
         <w:pStyle w:val="Toc"/>
       </w:pPr>
-      <w:hyperlink w:anchor="section_17" w:history="1">
+      <w:hyperlink w:anchor="section_18" w:history="1">
         <w:r>
           <w:t xml:space="preserve">16. Android / EAS Build System</w:t>
         </w:r>
@@ -231,7 +241,7 @@
       <w:pPr>
         <w:pStyle w:val="Toc"/>
       </w:pPr>
-      <w:hyperlink w:anchor="section_18" w:history="1">
+      <w:hyperlink w:anchor="section_19" w:history="1">
         <w:r>
           <w:t xml:space="preserve">17. APK Update Safety</w:t>
         </w:r>
@@ -241,7 +251,7 @@
       <w:pPr>
         <w:pStyle w:val="Toc"/>
       </w:pPr>
-      <w:hyperlink w:anchor="section_19" w:history="1">
+      <w:hyperlink w:anchor="section_20" w:history="1">
         <w:r>
           <w:t xml:space="preserve">18. Known Issues</w:t>
         </w:r>
@@ -251,7 +261,7 @@
       <w:pPr>
         <w:pStyle w:val="Toc"/>
       </w:pPr>
-      <w:hyperlink w:anchor="section_20" w:history="1">
+      <w:hyperlink w:anchor="section_21" w:history="1">
         <w:r>
           <w:t xml:space="preserve">19. Future Roadmap</w:t>
         </w:r>
@@ -261,7 +271,7 @@
       <w:pPr>
         <w:pStyle w:val="Toc"/>
       </w:pPr>
-      <w:hyperlink w:anchor="section_21" w:history="1">
+      <w:hyperlink w:anchor="section_22" w:history="1">
         <w:r>
           <w:t xml:space="preserve">20. Important Files</w:t>
         </w:r>
@@ -271,7 +281,7 @@
       <w:pPr>
         <w:pStyle w:val="Toc"/>
       </w:pPr>
-      <w:hyperlink w:anchor="section_22" w:history="1">
+      <w:hyperlink w:anchor="section_23" w:history="1">
         <w:r>
           <w:t xml:space="preserve">21. Important Technical Decisions</w:t>
         </w:r>
@@ -281,7 +291,7 @@
       <w:pPr>
         <w:pStyle w:val="Toc"/>
       </w:pPr>
-      <w:hyperlink w:anchor="section_23" w:history="1">
+      <w:hyperlink w:anchor="section_24" w:history="1">
         <w:r>
           <w:t xml:space="preserve">22. Instructions for Future LLMs</w:t>
         </w:r>
@@ -291,7 +301,7 @@
       <w:pPr>
         <w:pStyle w:val="Toc"/>
       </w:pPr>
-      <w:hyperlink w:anchor="section_24" w:history="1">
+      <w:hyperlink w:anchor="section_25" w:history="1">
         <w:r>
           <w:t xml:space="preserve">23. Current Project State</w:t>
         </w:r>
@@ -301,7 +311,7 @@
       <w:pPr>
         <w:pStyle w:val="Toc"/>
       </w:pPr>
-      <w:hyperlink w:anchor="section_25" w:history="1">
+      <w:hyperlink w:anchor="section_26" w:history="1">
         <w:r>
           <w:t xml:space="preserve">24. Changelog</w:t>
         </w:r>
@@ -316,11 +326,11 @@
       <w:pPr>
         <w:pStyle w:val="Heading1"/>
       </w:pPr>
-      <w:bookmarkStart w:id="33" w:name="section_1"/>
+      <w:bookmarkStart w:id="34" w:name="section_1"/>
       <w:r>
         <w:t xml:space="preserve">LifePilot – Master Project Context</w:t>
       </w:r>
-      <w:bookmarkEnd w:id="33"/>
+      <w:bookmarkEnd w:id="34"/>
     </w:p>
     <w:p>
       <w:pPr>
@@ -334,11 +344,11 @@
       <w:pPr>
         <w:pStyle w:val="Heading2"/>
       </w:pPr>
-      <w:bookmarkStart w:id="35" w:name="section_2"/>
+      <w:bookmarkStart w:id="36" w:name="section_2"/>
       <w:r>
         <w:t xml:space="preserve">1. Project Overview</w:t>
       </w:r>
-      <w:bookmarkEnd w:id="35"/>
+      <w:bookmarkEnd w:id="36"/>
     </w:p>
     <w:p>
       <w:pPr>
@@ -361,11 +371,11 @@
       <w:pPr>
         <w:pStyle w:val="Heading2"/>
       </w:pPr>
-      <w:bookmarkStart w:id="37" w:name="section_3"/>
+      <w:bookmarkStart w:id="38" w:name="section_3"/>
       <w:r>
         <w:t xml:space="preserve">2. Product Principles</w:t>
       </w:r>
-      <w:bookmarkEnd w:id="37"/>
+      <w:bookmarkEnd w:id="38"/>
     </w:p>
     <w:p>
       <w:pPr>
@@ -419,11 +429,11 @@
       <w:pPr>
         <w:pStyle w:val="Heading2"/>
       </w:pPr>
-      <w:bookmarkStart w:id="42" w:name="section_4"/>
+      <w:bookmarkStart w:id="43" w:name="section_4"/>
       <w:r>
         <w:t xml:space="preserve">3. Technology Stack</w:t>
       </w:r>
-      <w:bookmarkEnd w:id="42"/>
+      <w:bookmarkEnd w:id="43"/>
     </w:p>
     <w:p>
       <w:pPr>
@@ -889,11 +899,11 @@
       <w:pPr>
         <w:pStyle w:val="Heading2"/>
       </w:pPr>
-      <w:bookmarkStart w:id="46" w:name="section_5"/>
+      <w:bookmarkStart w:id="47" w:name="section_5"/>
       <w:r>
         <w:t xml:space="preserve">4. Architecture</w:t>
       </w:r>
-      <w:bookmarkEnd w:id="46"/>
+      <w:bookmarkEnd w:id="47"/>
     </w:p>
     <w:p>
       <w:pPr>
@@ -1049,11 +1059,11 @@
       <w:pPr>
         <w:pStyle w:val="Heading2"/>
       </w:pPr>
-      <w:bookmarkStart w:id="58" w:name="section_6"/>
+      <w:bookmarkStart w:id="59" w:name="section_6"/>
       <w:r>
         <w:t xml:space="preserve">5. Navigation</w:t>
       </w:r>
-      <w:bookmarkEnd w:id="58"/>
+      <w:bookmarkEnd w:id="59"/>
     </w:p>
     <w:p>
       <w:pPr>
@@ -1208,11 +1218,11 @@
       <w:pPr>
         <w:pStyle w:val="Heading2"/>
       </w:pPr>
-      <w:bookmarkStart w:id="60" w:name="section_7"/>
+      <w:bookmarkStart w:id="61" w:name="section_7"/>
       <w:r>
         <w:t xml:space="preserve">6. UI / Theme / Branding</w:t>
       </w:r>
-      <w:bookmarkEnd w:id="60"/>
+      <w:bookmarkEnd w:id="61"/>
     </w:p>
     <w:p>
       <w:pPr>
@@ -1341,11 +1351,11 @@
       <w:pPr>
         <w:pStyle w:val="Heading2"/>
       </w:pPr>
-      <w:bookmarkStart w:id="64" w:name="section_8"/>
+      <w:bookmarkStart w:id="65" w:name="section_8"/>
       <w:r>
         <w:t xml:space="preserve">7. Vehicle Manager</w:t>
       </w:r>
-      <w:bookmarkEnd w:id="64"/>
+      <w:bookmarkEnd w:id="65"/>
     </w:p>
     <w:p>
       <w:pPr>
@@ -1439,11 +1449,11 @@
       <w:pPr>
         <w:pStyle w:val="Heading2"/>
       </w:pPr>
-      <w:bookmarkStart w:id="67" w:name="section_9"/>
+      <w:bookmarkStart w:id="68" w:name="section_9"/>
       <w:r>
         <w:t xml:space="preserve">8. Personal Expense Manager</w:t>
       </w:r>
-      <w:bookmarkEnd w:id="67"/>
+      <w:bookmarkEnd w:id="68"/>
     </w:p>
     <w:p>
       <w:pPr>
@@ -1526,11 +1536,11 @@
       <w:pPr>
         <w:pStyle w:val="Heading2"/>
       </w:pPr>
-      <w:bookmarkStart w:id="69" w:name="section_10"/>
+      <w:bookmarkStart w:id="70" w:name="section_10"/>
       <w:r>
         <w:t xml:space="preserve">9. Tasks / To-Do</w:t>
       </w:r>
-      <w:bookmarkEnd w:id="69"/>
+      <w:bookmarkEnd w:id="70"/>
     </w:p>
     <w:p>
       <w:pPr>
@@ -1622,11 +1632,11 @@
       <w:pPr>
         <w:pStyle w:val="Heading2"/>
       </w:pPr>
-      <w:bookmarkStart w:id="71" w:name="section_11"/>
+      <w:bookmarkStart w:id="72" w:name="section_11"/>
       <w:r>
         <w:t xml:space="preserve">10. Database Architecture</w:t>
       </w:r>
-      <w:bookmarkEnd w:id="71"/>
+      <w:bookmarkEnd w:id="72"/>
     </w:p>
     <w:p>
       <w:pPr>
@@ -2346,11 +2356,11 @@
       <w:pPr>
         <w:pStyle w:val="Heading2"/>
       </w:pPr>
-      <w:bookmarkStart w:id="76" w:name="section_12"/>
+      <w:bookmarkStart w:id="77" w:name="section_12"/>
       <w:r>
         <w:t xml:space="preserve">11. File Storage</w:t>
       </w:r>
-      <w:bookmarkEnd w:id="76"/>
+      <w:bookmarkEnd w:id="77"/>
     </w:p>
     <w:p>
       <w:pPr>
@@ -2418,11 +2428,11 @@
       <w:pPr>
         <w:pStyle w:val="Heading2"/>
       </w:pPr>
-      <w:bookmarkStart w:id="78" w:name="section_13"/>
+      <w:bookmarkStart w:id="79" w:name="section_13"/>
       <w:r>
         <w:t xml:space="preserve">12. Notifications</w:t>
       </w:r>
-      <w:bookmarkEnd w:id="78"/>
+      <w:bookmarkEnd w:id="79"/>
     </w:p>
     <w:p>
       <w:pPr>
@@ -2533,11 +2543,90 @@
       <w:pPr>
         <w:pStyle w:val="Heading2"/>
       </w:pPr>
-      <w:bookmarkStart w:id="82" w:name="section_14"/>
+      <w:bookmarkStart w:id="83" w:name="section_14"/>
+      <w:r>
+        <w:t xml:space="preserve">12A. Backup &amp; Restore V1</w:t>
+      </w:r>
+      <w:bookmarkEnd w:id="83"/>
+    </w:p>
+    <w:p>
+      <w:pPr>
+        <w:pStyle w:val="Normal"/>
+      </w:pPr>
+      <w:r>
+        <w:t xml:space="preserve">Settings exposes a V2 Backup &amp; Restore screen. V1 creates a single </w:t>
+      </w:r>
+      <w:r>
+        <w:rPr>
+          <w:rStyle w:val="Code"/>
+        </w:rPr>
+        <w:t xml:space="preserve">.lpbackup</w:t>
+      </w:r>
+      <w:r>
+        <w:t xml:space="preserve"> JSON/Base64 package containing a consistent </w:t>
+      </w:r>
+      <w:r>
+        <w:rPr>
+          <w:rStyle w:val="Code"/>
+        </w:rPr>
+        <w:t xml:space="preserve">serializeAsync()</w:t>
+      </w:r>
+      <w:r>
+        <w:t xml:space="preserve"> snapshot of </w:t>
+      </w:r>
+      <w:r>
+        <w:rPr>
+          <w:rStyle w:val="Code"/>
+        </w:rPr>
+        <w:t xml:space="preserve">lifepilot.db</w:t>
+      </w:r>
+      <w:r>
+        <w:t xml:space="preserve">, all persistent files below the validated </w:t>
+      </w:r>
+      <w:r>
+        <w:rPr>
+          <w:rStyle w:val="Code"/>
+        </w:rPr>
+        <w:t xml:space="preserve">vehicle-photos</w:t>
+      </w:r>
+      <w:r>
+        <w:t xml:space="preserve"> root, a versioned manifest and SHA-256 plus byte size for every entry. This covers vehicle records/photos, service history/bills, insurance/PUC records and images, Personal Expenses, Tasks, categories and SQLite reminder preferences. Cache, staging, generated backups, credentials, build files, native notification inventory/permissions/channels and the separate device-local appearance preference database are excluded.</w:t>
+      </w:r>
+    </w:p>
+    <w:p>
+      <w:pPr>
+        <w:pStyle w:val="Normal"/>
+      </w:pPr>
+      <w:r>
+        <w:t xml:space="preserve">Restore inspection verifies structure, paths, counts, Base64 sizes, checksums, SQLite integrity and actual schema without changing active data. Schema v9 restores directly; older supported schemas use the existing migration function in isolation; newer schemas are rejected. Before replacement, the engine snapshots the current database and owned file tree. It writes through Expo SQLite's online backup API and replacement-restores only the owned file root, with database/file rollback on failure. The root coordinator unmounts navigation and reminder/task providers before authorizing replacement, blocks Android Back, releases suspension on failure and locks on a restart-required success screen.</w:t>
+      </w:r>
+    </w:p>
+    <w:p>
+      <w:pPr>
+        <w:pStyle w:val="Normal"/>
+      </w:pPr>
+      <w:r>
+        <w:t xml:space="preserve">Absolute attachment URIs in SQLite are safe across installations because storage helpers validate only the exact owner/path suffix and reconstruct files below the current </w:t>
+      </w:r>
+      <w:r>
+        <w:rPr>
+          <w:rStyle w:val="Code"/>
+        </w:rPr>
+        <w:t xml:space="preserve">Paths.document</w:t>
+      </w:r>
+      <w:r>
+        <w:t xml:space="preserve"> root. Restore resets the source device's notification permission-request flag and clears vehicle schedule/cleanup metadata while retaining user preferences and reminder sources. After restart, normal reconciliation uses the destination device's OS inventory to recreate eligible vehicle/task notifications; restore itself never requests permission. The JSON/Base64 implementation can use significant memory and still requires real Android testing for large packages, system pickers, online database replacement, rollback and restart behavior.</w:t>
+      </w:r>
+    </w:p>
+    <w:p>
+      <w:pPr>
+        <w:pStyle w:val="Heading2"/>
+      </w:pPr>
+      <w:bookmarkStart w:id="87" w:name="section_15"/>
       <w:r>
         <w:t xml:space="preserve">13. Testing</w:t>
       </w:r>
-      <w:bookmarkEnd w:id="82"/>
+      <w:bookmarkEnd w:id="87"/>
     </w:p>
     <w:p>
       <w:pPr>
@@ -2613,11 +2702,11 @@
       <w:pPr>
         <w:pStyle w:val="Heading2"/>
       </w:pPr>
-      <w:bookmarkStart w:id="85" w:name="section_15"/>
+      <w:bookmarkStart w:id="90" w:name="section_16"/>
       <w:r>
         <w:t xml:space="preserve">14. Development Environment</w:t>
       </w:r>
-      <w:bookmarkEnd w:id="85"/>
+      <w:bookmarkEnd w:id="90"/>
     </w:p>
     <w:p>
       <w:pPr>
@@ -2667,11 +2756,11 @@
       <w:pPr>
         <w:pStyle w:val="Heading2"/>
       </w:pPr>
-      <w:bookmarkStart w:id="87" w:name="section_16"/>
+      <w:bookmarkStart w:id="92" w:name="section_17"/>
       <w:r>
         <w:t xml:space="preserve">15. Git Workflow</w:t>
       </w:r>
-      <w:bookmarkEnd w:id="87"/>
+      <w:bookmarkEnd w:id="92"/>
     </w:p>
     <w:p>
       <w:pPr>
@@ -2748,11 +2837,11 @@
       <w:pPr>
         <w:pStyle w:val="Heading2"/>
       </w:pPr>
-      <w:bookmarkStart w:id="89" w:name="section_17"/>
+      <w:bookmarkStart w:id="94" w:name="section_18"/>
       <w:r>
         <w:t xml:space="preserve">16. Android / EAS Build System</w:t>
       </w:r>
-      <w:bookmarkEnd w:id="89"/>
+      <w:bookmarkEnd w:id="94"/>
     </w:p>
     <w:p>
       <w:pPr>
@@ -2909,11 +2998,11 @@
       <w:pPr>
         <w:pStyle w:val="Heading2"/>
       </w:pPr>
-      <w:bookmarkStart w:id="92" w:name="section_18"/>
+      <w:bookmarkStart w:id="97" w:name="section_19"/>
       <w:r>
         <w:t xml:space="preserve">17. APK Update Safety</w:t>
       </w:r>
-      <w:bookmarkEnd w:id="92"/>
+      <w:bookmarkEnd w:id="97"/>
     </w:p>
     <w:p>
       <w:pPr>
@@ -2981,11 +3070,11 @@
       <w:pPr>
         <w:pStyle w:val="Heading2"/>
       </w:pPr>
-      <w:bookmarkStart w:id="94" w:name="section_19"/>
+      <w:bookmarkStart w:id="99" w:name="section_20"/>
       <w:r>
         <w:t xml:space="preserve">18. Known Issues</w:t>
       </w:r>
-      <w:bookmarkEnd w:id="94"/>
+      <w:bookmarkEnd w:id="99"/>
     </w:p>
     <w:tbl>
       <w:tblPr>
@@ -3253,7 +3342,7 @@
               <w:pStyle w:val="TableBody"/>
             </w:pPr>
             <w:r>
-              <w:t xml:space="preserve">Planned</w:t>
+              <w:t xml:space="preserve">Needs device verification</w:t>
             </w:r>
           </w:p>
         </w:tc>
@@ -3267,7 +3356,7 @@
               <w:pStyle w:val="TableBody"/>
             </w:pPr>
             <w:r>
-              <w:t xml:space="preserve">Backup &amp; Restore</w:t>
+              <w:t xml:space="preserve">Backup &amp; Restore V1</w:t>
             </w:r>
           </w:p>
         </w:tc>
@@ -3281,7 +3370,7 @@
               <w:pStyle w:val="TableBody"/>
             </w:pPr>
             <w:r>
-              <w:t xml:space="preserve">There is no implemented transfer workflow for the SQLite database and owned photos/documents.</w:t>
+              <w:t xml:space="preserve">Create, inspect, replacement restore, rollback, cross-device path rebasing and restart locking are implemented and tested with native mocks.</w:t>
             </w:r>
           </w:p>
         </w:tc>
@@ -3295,7 +3384,7 @@
               <w:pStyle w:val="TableBody"/>
             </w:pPr>
             <w:r>
-              <w:t xml:space="preserve">Design a data-safe export/import format and validation flow before changing storage or schema.</w:t>
+              <w:t xml:space="preserve">Test system picker/export, large packages, online replacement, rollback and restart on Android with preserved installed data.</w:t>
             </w:r>
           </w:p>
         </w:tc>
@@ -3359,37 +3448,31 @@
       <w:pPr>
         <w:pStyle w:val="Heading2"/>
       </w:pPr>
-      <w:bookmarkStart w:id="96" w:name="section_20"/>
+      <w:bookmarkStart w:id="101" w:name="section_21"/>
       <w:r>
         <w:t xml:space="preserve">19. Future Roadmap</w:t>
       </w:r>
-      <w:bookmarkEnd w:id="96"/>
+      <w:bookmarkEnd w:id="101"/>
     </w:p>
     <w:p>
       <w:pPr>
         <w:pStyle w:val="Normal"/>
       </w:pPr>
       <w:r>
+        <w:t xml:space="preserve">Backup &amp; Restore V1 is implemented in source and awaits Android device validation. Future backup work may add streaming/archive packaging or encryption after V1 behavior is proven; cloud account and synchronization remain separate future work.</w:t>
+      </w:r>
+    </w:p>
+    <w:p>
+      <w:pPr>
+        <w:pStyle w:val="Normal"/>
+      </w:pPr>
+      <w:r>
+        <w:t xml:space="preserve">Other planned or future candidates are fuel/charging logs and reports; general vehicle document uploads; personal budgets, recurring entries, receipts and custom category editing; and task recurring items, subtasks, custom categories and attachments. These are </w:t>
+      </w:r>
+      <w:r>
         <w:rPr>
           <w:b/>
         </w:rPr>
-        <w:t xml:space="preserve">Next planned capability:</w:t>
-      </w:r>
-      <w:r>
-        <w:t xml:space="preserve"> Backup &amp; Restore so users can transfer LifePilot data, vehicle photos and stored documents to another phone. It is not implemented. The design must preserve ownership relationships, validate imported paths/data, avoid destructive replacement by default, and cover both database and owned files.</w:t>
-      </w:r>
-    </w:p>
-    <w:p>
-      <w:pPr>
-        <w:pStyle w:val="Normal"/>
-      </w:pPr>
-      <w:r>
-        <w:t xml:space="preserve">Other planned or future candidates are fuel/charging logs and reports; general vehicle document uploads; personal budgets, recurring entries, receipts and custom category editing; and task recurring items, subtasks, custom categories and attachments. These are </w:t>
-      </w:r>
-      <w:r>
-        <w:rPr>
-          <w:b/>
-        </w:rPr>
         <w:t xml:space="preserve">not implemented</w:t>
       </w:r>
       <w:r>
@@ -3400,11 +3483,11 @@
       <w:pPr>
         <w:pStyle w:val="Heading2"/>
       </w:pPr>
-      <w:bookmarkStart w:id="99" w:name="section_21"/>
+      <w:bookmarkStart w:id="104" w:name="section_22"/>
       <w:r>
         <w:t xml:space="preserve">20. Important Files</w:t>
       </w:r>
-      <w:bookmarkEnd w:id="99"/>
+      <w:bookmarkEnd w:id="104"/>
     </w:p>
     <w:tbl>
       <w:tblPr>
@@ -4002,11 +4085,11 @@
       <w:pPr>
         <w:pStyle w:val="Heading2"/>
       </w:pPr>
-      <w:bookmarkStart w:id="101" w:name="section_22"/>
+      <w:bookmarkStart w:id="106" w:name="section_23"/>
       <w:r>
         <w:t xml:space="preserve">21. Important Technical Decisions</w:t>
       </w:r>
-      <w:bookmarkEnd w:id="101"/>
+      <w:bookmarkEnd w:id="106"/>
     </w:p>
     <w:p>
       <w:pPr>
@@ -4509,11 +4592,11 @@
       <w:pPr>
         <w:pStyle w:val="Heading2"/>
       </w:pPr>
-      <w:bookmarkStart w:id="104" w:name="section_23"/>
+      <w:bookmarkStart w:id="109" w:name="section_24"/>
       <w:r>
         <w:t xml:space="preserve">22. Instructions for Future LLMs</w:t>
       </w:r>
-      <w:bookmarkEnd w:id="104"/>
+      <w:bookmarkEnd w:id="109"/>
     </w:p>
     <w:p>
       <w:pPr>
@@ -4527,11 +4610,11 @@
       <w:pPr>
         <w:pStyle w:val="Heading2"/>
       </w:pPr>
-      <w:bookmarkStart w:id="106" w:name="section_24"/>
+      <w:bookmarkStart w:id="111" w:name="section_25"/>
       <w:r>
         <w:t xml:space="preserve">23. Current Project State</w:t>
       </w:r>
-      <w:bookmarkEnd w:id="106"/>
+      <w:bookmarkEnd w:id="111"/>
     </w:p>
     <w:p>
       <w:pPr>
@@ -4548,7 +4631,7 @@
         <w:t xml:space="preserve">Completed in source:</w:t>
       </w:r>
       <w:r>
-        <w:t xml:space="preserve"> UI/UX V2 across Home, Tasks, Garage/Vehicle Detail, Personal Expenses, Vehicle Reminders/Settings, Settings/About and remaining vehicle forms; vehicle CRUD/photos/services/coverage; personal transactions and analytics; tasks; appearance themes; local reminder scheduling; Expo Go notification isolation; migrations through v9; and regression scripts.</w:t>
+        <w:t xml:space="preserve"> UI/UX V2 across Home, Tasks, Garage/Vehicle Detail, Personal Expenses, Vehicle Reminders/Settings, Settings/About and remaining vehicle forms; vehicle CRUD/photos/services/coverage; personal transactions and analytics; tasks; appearance themes; local reminder scheduling; Expo Go notification isolation; Backup &amp; Restore V1 create/inspect/replacement/rollback UI and engines; migrations through v9; and regression scripts.</w:t>
       </w:r>
     </w:p>
     <w:p>
@@ -4602,18 +4685,18 @@
         <w:t xml:space="preserve">Next:</w:t>
       </w:r>
       <w:r>
-        <w:t xml:space="preserve"> design and implement Backup &amp; Restore for transferring the database plus owned photos/documents between phones. Fuel/charging, general document uploads and cloud account/sync remain future work.</w:t>
+        <w:t xml:space="preserve"> complete real-device Backup &amp; Restore and final V2 regression testing. Fuel/charging, general document uploads and cloud account/sync remain future work.</w:t>
       </w:r>
     </w:p>
     <w:p>
       <w:pPr>
         <w:pStyle w:val="Heading2"/>
       </w:pPr>
-      <w:bookmarkStart w:id="111" w:name="section_25"/>
+      <w:bookmarkStart w:id="116" w:name="section_26"/>
       <w:r>
         <w:t xml:space="preserve">24. Changelog</w:t>
       </w:r>
-      <w:bookmarkEnd w:id="111"/>
+      <w:bookmarkEnd w:id="116"/>
     </w:p>
     <w:tbl>
       <w:tblPr>
@@ -4943,6 +5026,47 @@
             </w:pPr>
             <w:r>
               <w:t xml:space="preserve">Future transfer must include SQLite data and LifePilot-owned photos/documents; cloud account/sync remains later work.</w:t>
+            </w:r>
+          </w:p>
+        </w:tc>
+      </w:tr>
+      <w:tr>
+        <w:tc>
+          <w:tcPr>
+            <w:tcW w:w="1100" w:type="dxa"/>
+          </w:tcPr>
+          <w:p>
+            <w:pPr>
+              <w:pStyle w:val="TableBody"/>
+            </w:pPr>
+            <w:r>
+              <w:t xml:space="preserve">2026-09-21</w:t>
+            </w:r>
+          </w:p>
+        </w:tc>
+        <w:tc>
+          <w:tcPr>
+            <w:tcW w:w="1850" w:type="dxa"/>
+          </w:tcPr>
+          <w:p>
+            <w:pPr>
+              <w:pStyle w:val="TableBody"/>
+            </w:pPr>
+            <w:r>
+              <w:t xml:space="preserve">Implemented and audited Backup &amp; Restore V1.</w:t>
+            </w:r>
+          </w:p>
+        </w:tc>
+        <w:tc>
+          <w:tcPr>
+            <w:tcW w:w="6410" w:type="dxa"/>
+          </w:tcPr>
+          <w:p>
+            <w:pPr>
+              <w:pStyle w:val="TableBody"/>
+            </w:pPr>
+            <w:r>
+              <w:t xml:space="preserve">Adds checksummed portable packages, safe inspection, isolated migration, coordinated replacement/rollback, cross-device path rebasing and restart locking without a schema or dependency change.</w:t>
             </w:r>
           </w:p>
         </w:tc>

</xml_diff>

<commit_message>
feat: harden backup restore with operation lifecycle
</commit_message>
<xml_diff>
--- a/docs/LifePilot_Project_Guide.docx
+++ b/docs/LifePilot_Project_Guide.docx
@@ -33,7 +33,7 @@
         <w:spacing w:before="600"/>
       </w:pPr>
       <w:r>
-        <w:t xml:space="preserve">Last updated: 2026-09-21</w:t>
+        <w:t xml:space="preserve">Last updated: 2026-09-28</w:t>
       </w:r>
     </w:p>
     <w:p>
@@ -203,6 +203,16 @@
       </w:pPr>
       <w:hyperlink w:anchor="section_15" w:history="1">
         <w:r>
+          <w:t xml:space="preserve">Operation ownership and recovery persistence</w:t>
+        </w:r>
+      </w:hyperlink>
+    </w:p>
+    <w:p>
+      <w:pPr>
+        <w:pStyle w:val="Toc"/>
+      </w:pPr>
+      <w:hyperlink w:anchor="section_16" w:history="1">
+        <w:r>
           <w:t xml:space="preserve">13. Testing</w:t>
         </w:r>
       </w:hyperlink>
@@ -211,7 +221,7 @@
       <w:pPr>
         <w:pStyle w:val="Toc"/>
       </w:pPr>
-      <w:hyperlink w:anchor="section_16" w:history="1">
+      <w:hyperlink w:anchor="section_17" w:history="1">
         <w:r>
           <w:t xml:space="preserve">14. Development Environment</w:t>
         </w:r>
@@ -221,7 +231,7 @@
       <w:pPr>
         <w:pStyle w:val="Toc"/>
       </w:pPr>
-      <w:hyperlink w:anchor="section_17" w:history="1">
+      <w:hyperlink w:anchor="section_18" w:history="1">
         <w:r>
           <w:t xml:space="preserve">15. Git Workflow</w:t>
         </w:r>
@@ -231,7 +241,7 @@
       <w:pPr>
         <w:pStyle w:val="Toc"/>
       </w:pPr>
-      <w:hyperlink w:anchor="section_18" w:history="1">
+      <w:hyperlink w:anchor="section_19" w:history="1">
         <w:r>
           <w:t xml:space="preserve">16. Android / EAS Build System</w:t>
         </w:r>
@@ -241,7 +251,7 @@
       <w:pPr>
         <w:pStyle w:val="Toc"/>
       </w:pPr>
-      <w:hyperlink w:anchor="section_19" w:history="1">
+      <w:hyperlink w:anchor="section_20" w:history="1">
         <w:r>
           <w:t xml:space="preserve">17. APK Update Safety</w:t>
         </w:r>
@@ -251,7 +261,7 @@
       <w:pPr>
         <w:pStyle w:val="Toc"/>
       </w:pPr>
-      <w:hyperlink w:anchor="section_20" w:history="1">
+      <w:hyperlink w:anchor="section_21" w:history="1">
         <w:r>
           <w:t xml:space="preserve">18. Known Issues</w:t>
         </w:r>
@@ -261,7 +271,7 @@
       <w:pPr>
         <w:pStyle w:val="Toc"/>
       </w:pPr>
-      <w:hyperlink w:anchor="section_21" w:history="1">
+      <w:hyperlink w:anchor="section_22" w:history="1">
         <w:r>
           <w:t xml:space="preserve">19. Future Roadmap</w:t>
         </w:r>
@@ -271,7 +281,7 @@
       <w:pPr>
         <w:pStyle w:val="Toc"/>
       </w:pPr>
-      <w:hyperlink w:anchor="section_22" w:history="1">
+      <w:hyperlink w:anchor="section_23" w:history="1">
         <w:r>
           <w:t xml:space="preserve">20. Important Files</w:t>
         </w:r>
@@ -281,7 +291,7 @@
       <w:pPr>
         <w:pStyle w:val="Toc"/>
       </w:pPr>
-      <w:hyperlink w:anchor="section_23" w:history="1">
+      <w:hyperlink w:anchor="section_24" w:history="1">
         <w:r>
           <w:t xml:space="preserve">21. Important Technical Decisions</w:t>
         </w:r>
@@ -291,7 +301,7 @@
       <w:pPr>
         <w:pStyle w:val="Toc"/>
       </w:pPr>
-      <w:hyperlink w:anchor="section_24" w:history="1">
+      <w:hyperlink w:anchor="section_25" w:history="1">
         <w:r>
           <w:t xml:space="preserve">22. Instructions for Future LLMs</w:t>
         </w:r>
@@ -301,7 +311,7 @@
       <w:pPr>
         <w:pStyle w:val="Toc"/>
       </w:pPr>
-      <w:hyperlink w:anchor="section_25" w:history="1">
+      <w:hyperlink w:anchor="section_26" w:history="1">
         <w:r>
           <w:t xml:space="preserve">23. Current Project State</w:t>
         </w:r>
@@ -311,7 +321,7 @@
       <w:pPr>
         <w:pStyle w:val="Toc"/>
       </w:pPr>
-      <w:hyperlink w:anchor="section_26" w:history="1">
+      <w:hyperlink w:anchor="section_27" w:history="1">
         <w:r>
           <w:t xml:space="preserve">24. Changelog</w:t>
         </w:r>
@@ -326,29 +336,29 @@
       <w:pPr>
         <w:pStyle w:val="Heading1"/>
       </w:pPr>
-      <w:bookmarkStart w:id="34" w:name="section_1"/>
+      <w:bookmarkStart w:id="35" w:name="section_1"/>
       <w:r>
         <w:t xml:space="preserve">LifePilot – Master Project Context</w:t>
       </w:r>
-      <w:bookmarkEnd w:id="34"/>
+      <w:bookmarkEnd w:id="35"/>
     </w:p>
     <w:p>
       <w:pPr>
         <w:pStyle w:val="Normal"/>
       </w:pPr>
       <w:r>
-        <w:t xml:space="preserve">Last repository review: 2026-09-21. Source code is authoritative if this document becomes stale. This is a snapshot of the checked-out repository, not proof of behavior on an installed phone.</w:t>
+        <w:t xml:space="preserve">Last repository review: 2026-09-28. Source code is authoritative if this document becomes stale. This is a snapshot of the checked-out repository, not proof of behavior on an installed phone.</w:t>
       </w:r>
     </w:p>
     <w:p>
       <w:pPr>
         <w:pStyle w:val="Heading2"/>
       </w:pPr>
-      <w:bookmarkStart w:id="36" w:name="section_2"/>
+      <w:bookmarkStart w:id="37" w:name="section_2"/>
       <w:r>
         <w:t xml:space="preserve">1. Project Overview</w:t>
       </w:r>
-      <w:bookmarkEnd w:id="36"/>
+      <w:bookmarkEnd w:id="37"/>
     </w:p>
     <w:p>
       <w:pPr>
@@ -371,11 +381,11 @@
       <w:pPr>
         <w:pStyle w:val="Heading2"/>
       </w:pPr>
-      <w:bookmarkStart w:id="38" w:name="section_3"/>
+      <w:bookmarkStart w:id="39" w:name="section_3"/>
       <w:r>
         <w:t xml:space="preserve">2. Product Principles</w:t>
       </w:r>
-      <w:bookmarkEnd w:id="38"/>
+      <w:bookmarkEnd w:id="39"/>
     </w:p>
     <w:p>
       <w:pPr>
@@ -429,11 +439,11 @@
       <w:pPr>
         <w:pStyle w:val="Heading2"/>
       </w:pPr>
-      <w:bookmarkStart w:id="43" w:name="section_4"/>
+      <w:bookmarkStart w:id="44" w:name="section_4"/>
       <w:r>
         <w:t xml:space="preserve">3. Technology Stack</w:t>
       </w:r>
-      <w:bookmarkEnd w:id="43"/>
+      <w:bookmarkEnd w:id="44"/>
     </w:p>
     <w:p>
       <w:pPr>
@@ -899,11 +909,11 @@
       <w:pPr>
         <w:pStyle w:val="Heading2"/>
       </w:pPr>
-      <w:bookmarkStart w:id="47" w:name="section_5"/>
+      <w:bookmarkStart w:id="48" w:name="section_5"/>
       <w:r>
         <w:t xml:space="preserve">4. Architecture</w:t>
       </w:r>
-      <w:bookmarkEnd w:id="47"/>
+      <w:bookmarkEnd w:id="48"/>
     </w:p>
     <w:p>
       <w:pPr>
@@ -1059,11 +1069,11 @@
       <w:pPr>
         <w:pStyle w:val="Heading2"/>
       </w:pPr>
-      <w:bookmarkStart w:id="59" w:name="section_6"/>
+      <w:bookmarkStart w:id="60" w:name="section_6"/>
       <w:r>
         <w:t xml:space="preserve">5. Navigation</w:t>
       </w:r>
-      <w:bookmarkEnd w:id="59"/>
+      <w:bookmarkEnd w:id="60"/>
     </w:p>
     <w:p>
       <w:pPr>
@@ -1218,11 +1228,11 @@
       <w:pPr>
         <w:pStyle w:val="Heading2"/>
       </w:pPr>
-      <w:bookmarkStart w:id="61" w:name="section_7"/>
+      <w:bookmarkStart w:id="62" w:name="section_7"/>
       <w:r>
         <w:t xml:space="preserve">6. UI / Theme / Branding</w:t>
       </w:r>
-      <w:bookmarkEnd w:id="61"/>
+      <w:bookmarkEnd w:id="62"/>
     </w:p>
     <w:p>
       <w:pPr>
@@ -1351,11 +1361,11 @@
       <w:pPr>
         <w:pStyle w:val="Heading2"/>
       </w:pPr>
-      <w:bookmarkStart w:id="65" w:name="section_8"/>
+      <w:bookmarkStart w:id="66" w:name="section_8"/>
       <w:r>
         <w:t xml:space="preserve">7. Vehicle Manager</w:t>
       </w:r>
-      <w:bookmarkEnd w:id="65"/>
+      <w:bookmarkEnd w:id="66"/>
     </w:p>
     <w:p>
       <w:pPr>
@@ -1449,11 +1459,11 @@
       <w:pPr>
         <w:pStyle w:val="Heading2"/>
       </w:pPr>
-      <w:bookmarkStart w:id="68" w:name="section_9"/>
+      <w:bookmarkStart w:id="69" w:name="section_9"/>
       <w:r>
         <w:t xml:space="preserve">8. Personal Expense Manager</w:t>
       </w:r>
-      <w:bookmarkEnd w:id="68"/>
+      <w:bookmarkEnd w:id="69"/>
     </w:p>
     <w:p>
       <w:pPr>
@@ -1536,11 +1546,11 @@
       <w:pPr>
         <w:pStyle w:val="Heading2"/>
       </w:pPr>
-      <w:bookmarkStart w:id="70" w:name="section_10"/>
+      <w:bookmarkStart w:id="71" w:name="section_10"/>
       <w:r>
         <w:t xml:space="preserve">9. Tasks / To-Do</w:t>
       </w:r>
-      <w:bookmarkEnd w:id="70"/>
+      <w:bookmarkEnd w:id="71"/>
     </w:p>
     <w:p>
       <w:pPr>
@@ -1632,11 +1642,11 @@
       <w:pPr>
         <w:pStyle w:val="Heading2"/>
       </w:pPr>
-      <w:bookmarkStart w:id="72" w:name="section_11"/>
+      <w:bookmarkStart w:id="73" w:name="section_11"/>
       <w:r>
         <w:t xml:space="preserve">10. Database Architecture</w:t>
       </w:r>
-      <w:bookmarkEnd w:id="72"/>
+      <w:bookmarkEnd w:id="73"/>
     </w:p>
     <w:p>
       <w:pPr>
@@ -2356,11 +2366,11 @@
       <w:pPr>
         <w:pStyle w:val="Heading2"/>
       </w:pPr>
-      <w:bookmarkStart w:id="77" w:name="section_12"/>
+      <w:bookmarkStart w:id="78" w:name="section_12"/>
       <w:r>
         <w:t xml:space="preserve">11. File Storage</w:t>
       </w:r>
-      <w:bookmarkEnd w:id="77"/>
+      <w:bookmarkEnd w:id="78"/>
     </w:p>
     <w:p>
       <w:pPr>
@@ -2428,11 +2438,11 @@
       <w:pPr>
         <w:pStyle w:val="Heading2"/>
       </w:pPr>
-      <w:bookmarkStart w:id="79" w:name="section_13"/>
+      <w:bookmarkStart w:id="80" w:name="section_13"/>
       <w:r>
         <w:t xml:space="preserve">12. Notifications</w:t>
       </w:r>
-      <w:bookmarkEnd w:id="79"/>
+      <w:bookmarkEnd w:id="80"/>
     </w:p>
     <w:p>
       <w:pPr>
@@ -2543,11 +2553,11 @@
       <w:pPr>
         <w:pStyle w:val="Heading2"/>
       </w:pPr>
-      <w:bookmarkStart w:id="83" w:name="section_14"/>
+      <w:bookmarkStart w:id="84" w:name="section_14"/>
       <w:r>
         <w:t xml:space="preserve">12A. Backup &amp; Restore V1</w:t>
       </w:r>
-      <w:bookmarkEnd w:id="83"/>
+      <w:bookmarkEnd w:id="84"/>
     </w:p>
     <w:p>
       <w:pPr>
@@ -2598,7 +2608,7 @@
         <w:pStyle w:val="Normal"/>
       </w:pPr>
       <w:r>
-        <w:t xml:space="preserve">Restore inspection verifies structure, paths, counts, Base64 sizes, checksums, SQLite integrity and actual schema without changing active data. Schema v9 restores directly; older supported schemas use the existing migration function in isolation; newer schemas are rejected. Before replacement, the engine snapshots the current database and owned file tree. It writes through Expo SQLite's online backup API and replacement-restores only the owned file root, with database/file rollback on failure. The root coordinator unmounts navigation and reminder/task providers before authorizing replacement, blocks Android Back, releases suspension on failure and locks on a restart-required success screen.</w:t>
+        <w:t xml:space="preserve">Restore inspection verifies structure, paths, counts, Base64 sizes, checksums, SQLite integrity and actual schema without changing active data. Schema v9 restores directly; older supported schemas use the existing migration function in isolation; newer schemas are rejected. Before replacement, the engine snapshots the current database and owned file tree. It writes through Expo SQLite's online backup API and replacement-restores only the owned file root, with database/file rollback on failure. The root coordinator synchronously closes mutation admission, unmounts navigation/providers and awaits the central activity drain before authorizing replacement. Recoverable failures release ownership; successful restore keeps the restart-required lock. Catastrophic rollback failure retains exclusive ownership and a recovery screen that blocks Android Back and instructs the user to stop using LifePilot and close it without claiming that reopening repairs data.</w:t>
       </w:r>
     </w:p>
     <w:p>
@@ -2620,13 +2630,81 @@
     </w:p>
     <w:p>
       <w:pPr>
+        <w:pStyle w:val="Heading3"/>
+      </w:pPr>
+      <w:bookmarkStart w:id="88" w:name="section_15"/>
+      <w:r>
+        <w:t xml:space="preserve">Operation ownership and recovery persistence</w:t>
+      </w:r>
+      <w:bookmarkEnd w:id="88"/>
+    </w:p>
+    <w:p>
+      <w:pPr>
+        <w:pStyle w:val="Normal"/>
+      </w:pPr>
+      <w:r>
+        <w:rPr>
+          <w:rStyle w:val="Code"/>
+        </w:rPr>
+        <w:t xml:space="preserve">src/features/activity/operation-lifecycle.ts</w:t>
+      </w:r>
+      <w:r>
+        <w:t xml:space="preserve"> provides normal/suspending/exclusive/resuming states, exception-safe leases, explicit shared </w:t>
+      </w:r>
+      <w:r>
+        <w:rPr>
+          <w:rStyle w:val="Code"/>
+        </w:rPr>
+        <w:t xml:space="preserve">OperationContext</w:t>
+      </w:r>
+      <w:r>
+        <w:t xml:space="preserve"> values and identity-validated exclusive authorization. Whole vehicle workflows, repository mutations, private connection closure, filesystem/error cleanup, personal/task mutations, reminder writes and reconciliation, permission continuations, cleanup retries and backup creation are covered. Nested helpers share the admitted context and may finish during suspension. New operations are rejected synchronously; queued task reconciliation is invalidated by suspension. Reads and the separate appearance preference database remain outside the mutation barrier. Startup migration precedes application operations; staged restore migration runs under exclusive ownership. No schema change, dependency addition or backup-format change was required.</w:t>
+      </w:r>
+    </w:p>
+    <w:p>
+      <w:pPr>
+        <w:pStyle w:val="Normal"/>
+      </w:pPr>
+      <w:r>
+        <w:t xml:space="preserve">Each restore persists a unique private </w:t>
+      </w:r>
+      <w:r>
+        <w:rPr>
+          <w:rStyle w:val="Code"/>
+        </w:rPr>
+        <w:t xml:space="preserve">lifepilot-recovery/restore-&lt;UUID&gt;</w:t>
+      </w:r>
+      <w:r>
+        <w:t xml:space="preserve"> set containing previous SQLite bytes, previous owned files, incoming staging and versioned phase/path metadata before replacing active data. Copies are read back and the saved database checked. Successful restore and verified rollback clean only that attempt's artifacts; rollback failure retains them and a typed </w:t>
+      </w:r>
+      <w:r>
+        <w:rPr>
+          <w:rStyle w:val="Code"/>
+        </w:rPr>
+        <w:t xml:space="preserve">RollbackFailureError</w:t>
+      </w:r>
+      <w:r>
+        <w:t xml:space="preserve"> keeps the process locked. Later attempts never erase older recovery sets. There is no automatic recovery or startup validation of retained sets, so reopening after catastrophe does not prove data consistency. See </w:t>
+      </w:r>
+      <w:r>
+        <w:rPr>
+          <w:rStyle w:val="Code"/>
+        </w:rPr>
+        <w:t xml:space="preserve">docs/BACKUP_FORMAT.md</w:t>
+      </w:r>
+      <w:r>
+        <w:t xml:space="preserve"> for the complete lease contract, boundaries, artifact lifecycle and testing limits.</w:t>
+      </w:r>
+    </w:p>
+    <w:p>
+      <w:pPr>
         <w:pStyle w:val="Heading2"/>
       </w:pPr>
-      <w:bookmarkStart w:id="87" w:name="section_15"/>
+      <w:bookmarkStart w:id="91" w:name="section_16"/>
       <w:r>
         <w:t xml:space="preserve">13. Testing</w:t>
       </w:r>
-      <w:bookmarkEnd w:id="87"/>
+      <w:bookmarkEnd w:id="91"/>
     </w:p>
     <w:p>
       <w:pPr>
@@ -2687,7 +2765,7 @@
         <w:t xml:space="preserve">tests/</w:t>
       </w:r>
       <w:r>
-        <w:t xml:space="preserve"> directory or Jest script.</w:t>
+        <w:t xml:space="preserve"> directory or Jest script. Operation lifecycle and restore-session regression scripts now exercise cross-domain races, queue invalidation, cleanup/private-connection drain and locked outcomes; restore tests cover persistent recovery material and collision isolation. The shared test loader preserves module identity for operation contexts. Native APIs and Back handling are mocked in these tests.</w:t>
       </w:r>
     </w:p>
     <w:p>
@@ -2702,11 +2780,11 @@
       <w:pPr>
         <w:pStyle w:val="Heading2"/>
       </w:pPr>
-      <w:bookmarkStart w:id="90" w:name="section_16"/>
+      <w:bookmarkStart w:id="94" w:name="section_17"/>
       <w:r>
         <w:t xml:space="preserve">14. Development Environment</w:t>
       </w:r>
-      <w:bookmarkEnd w:id="90"/>
+      <w:bookmarkEnd w:id="94"/>
     </w:p>
     <w:p>
       <w:pPr>
@@ -2756,11 +2834,11 @@
       <w:pPr>
         <w:pStyle w:val="Heading2"/>
       </w:pPr>
-      <w:bookmarkStart w:id="92" w:name="section_17"/>
+      <w:bookmarkStart w:id="96" w:name="section_18"/>
       <w:r>
         <w:t xml:space="preserve">15. Git Workflow</w:t>
       </w:r>
-      <w:bookmarkEnd w:id="92"/>
+      <w:bookmarkEnd w:id="96"/>
     </w:p>
     <w:p>
       <w:pPr>
@@ -2837,11 +2915,11 @@
       <w:pPr>
         <w:pStyle w:val="Heading2"/>
       </w:pPr>
-      <w:bookmarkStart w:id="94" w:name="section_18"/>
+      <w:bookmarkStart w:id="98" w:name="section_19"/>
       <w:r>
         <w:t xml:space="preserve">16. Android / EAS Build System</w:t>
       </w:r>
-      <w:bookmarkEnd w:id="94"/>
+      <w:bookmarkEnd w:id="98"/>
     </w:p>
     <w:p>
       <w:pPr>
@@ -2998,11 +3076,11 @@
       <w:pPr>
         <w:pStyle w:val="Heading2"/>
       </w:pPr>
-      <w:bookmarkStart w:id="97" w:name="section_19"/>
+      <w:bookmarkStart w:id="101" w:name="section_20"/>
       <w:r>
         <w:t xml:space="preserve">17. APK Update Safety</w:t>
       </w:r>
-      <w:bookmarkEnd w:id="97"/>
+      <w:bookmarkEnd w:id="101"/>
     </w:p>
     <w:p>
       <w:pPr>
@@ -3070,11 +3148,11 @@
       <w:pPr>
         <w:pStyle w:val="Heading2"/>
       </w:pPr>
-      <w:bookmarkStart w:id="99" w:name="section_20"/>
+      <w:bookmarkStart w:id="103" w:name="section_21"/>
       <w:r>
         <w:t xml:space="preserve">18. Known Issues</w:t>
       </w:r>
-      <w:bookmarkEnd w:id="99"/>
+      <w:bookmarkEnd w:id="103"/>
     </w:p>
     <w:tbl>
       <w:tblPr>
@@ -3370,7 +3448,7 @@
               <w:pStyle w:val="TableBody"/>
             </w:pPr>
             <w:r>
-              <w:t xml:space="preserve">Create, inspect, replacement restore, rollback, cross-device path rebasing and restart locking are implemented and tested with native mocks.</w:t>
+              <w:t xml:space="preserve">Create/inspect/restore, operation drain, persistent rollback, catastrophic lock and cross-device paths are implemented with automated/mock coverage; retained recovery sets have no automatic recovery UI.</w:t>
             </w:r>
           </w:p>
         </w:tc>
@@ -3384,7 +3462,7 @@
               <w:pStyle w:val="TableBody"/>
             </w:pPr>
             <w:r>
-              <w:t xml:space="preserve">Test system picker/export, large packages, online replacement, rollback and restart on Android with preserved installed data.</w:t>
+              <w:t xml:space="preserve">Test picker/export, large packages, concurrent operations, low storage, online replacement, rollback failure, retained artifacts and interruption/restart on Android with preserved installed data.</w:t>
             </w:r>
           </w:p>
         </w:tc>
@@ -3448,11 +3526,11 @@
       <w:pPr>
         <w:pStyle w:val="Heading2"/>
       </w:pPr>
-      <w:bookmarkStart w:id="101" w:name="section_21"/>
+      <w:bookmarkStart w:id="105" w:name="section_22"/>
       <w:r>
         <w:t xml:space="preserve">19. Future Roadmap</w:t>
       </w:r>
-      <w:bookmarkEnd w:id="101"/>
+      <w:bookmarkEnd w:id="105"/>
     </w:p>
     <w:p>
       <w:pPr>
@@ -3483,11 +3561,11 @@
       <w:pPr>
         <w:pStyle w:val="Heading2"/>
       </w:pPr>
-      <w:bookmarkStart w:id="104" w:name="section_22"/>
+      <w:bookmarkStart w:id="108" w:name="section_23"/>
       <w:r>
         <w:t xml:space="preserve">20. Important Files</w:t>
       </w:r>
-      <w:bookmarkEnd w:id="104"/>
+      <w:bookmarkEnd w:id="108"/>
     </w:p>
     <w:tbl>
       <w:tblPr>
@@ -4085,11 +4163,11 @@
       <w:pPr>
         <w:pStyle w:val="Heading2"/>
       </w:pPr>
-      <w:bookmarkStart w:id="106" w:name="section_23"/>
+      <w:bookmarkStart w:id="110" w:name="section_24"/>
       <w:r>
         <w:t xml:space="preserve">21. Important Technical Decisions</w:t>
       </w:r>
-      <w:bookmarkEnd w:id="106"/>
+      <w:bookmarkEnd w:id="110"/>
     </w:p>
     <w:p>
       <w:pPr>
@@ -4592,11 +4670,11 @@
       <w:pPr>
         <w:pStyle w:val="Heading2"/>
       </w:pPr>
-      <w:bookmarkStart w:id="109" w:name="section_24"/>
+      <w:bookmarkStart w:id="113" w:name="section_25"/>
       <w:r>
         <w:t xml:space="preserve">22. Instructions for Future LLMs</w:t>
       </w:r>
-      <w:bookmarkEnd w:id="109"/>
+      <w:bookmarkEnd w:id="113"/>
     </w:p>
     <w:p>
       <w:pPr>
@@ -4610,11 +4688,11 @@
       <w:pPr>
         <w:pStyle w:val="Heading2"/>
       </w:pPr>
-      <w:bookmarkStart w:id="111" w:name="section_25"/>
+      <w:bookmarkStart w:id="115" w:name="section_26"/>
       <w:r>
         <w:t xml:space="preserve">23. Current Project State</w:t>
       </w:r>
-      <w:bookmarkEnd w:id="111"/>
+      <w:bookmarkEnd w:id="115"/>
     </w:p>
     <w:p>
       <w:pPr>
@@ -4631,7 +4709,7 @@
         <w:t xml:space="preserve">Completed in source:</w:t>
       </w:r>
       <w:r>
-        <w:t xml:space="preserve"> UI/UX V2 across Home, Tasks, Garage/Vehicle Detail, Personal Expenses, Vehicle Reminders/Settings, Settings/About and remaining vehicle forms; vehicle CRUD/photos/services/coverage; personal transactions and analytics; tasks; appearance themes; local reminder scheduling; Expo Go notification isolation; Backup &amp; Restore V1 create/inspect/replacement/rollback UI and engines; migrations through v9; and regression scripts.</w:t>
+        <w:t xml:space="preserve"> UI/UX V2 across Home, Tasks, Garage/Vehicle Detail, Personal Expenses, Vehicle Reminders/Settings, Settings/About and remaining vehicle forms; vehicle CRUD/photos/services/coverage; personal transactions and analytics; tasks; appearance themes; local reminder scheduling; Expo Go notification isolation; Backup &amp; Restore V1 create/inspect/replacement/rollback UI and engines, shared mutation leases/exclusive maintenance and persistent catastrophic recovery material; migrations through v9; and regression scripts.</w:t>
       </w:r>
     </w:p>
     <w:p>
@@ -4685,18 +4763,18 @@
         <w:t xml:space="preserve">Next:</w:t>
       </w:r>
       <w:r>
-        <w:t xml:space="preserve"> complete real-device Backup &amp; Restore and final V2 regression testing. Fuel/charging, general document uploads and cloud account/sync remain future work.</w:t>
+        <w:t xml:space="preserve"> complete real-device Backup &amp; Restore safety tests (including in-flight operations, rollback failure and process interruption) and final V2 regression testing. Fuel/charging, general document uploads and cloud account/sync remain future work.</w:t>
       </w:r>
     </w:p>
     <w:p>
       <w:pPr>
         <w:pStyle w:val="Heading2"/>
       </w:pPr>
-      <w:bookmarkStart w:id="116" w:name="section_26"/>
+      <w:bookmarkStart w:id="120" w:name="section_27"/>
       <w:r>
         <w:t xml:space="preserve">24. Changelog</w:t>
       </w:r>
-      <w:bookmarkEnd w:id="116"/>
+      <w:bookmarkEnd w:id="120"/>
     </w:p>
     <w:tbl>
       <w:tblPr>
@@ -5067,6 +5145,50 @@
             </w:pPr>
             <w:r>
               <w:t xml:space="preserve">Adds checksummed portable packages, safe inspection, isolated migration, coordinated replacement/rollback, cross-device path rebasing and restart locking without a schema or dependency change.</w:t>
+            </w:r>
+          </w:p>
+        </w:tc>
+      </w:tr>
+      <w:tr>
+        <w:tc>
+          <w:tcPr>
+            <w:tcW w:w="1100" w:type="dxa"/>
+            <w:shd w:fill="F7FAF8"/>
+          </w:tcPr>
+          <w:p>
+            <w:pPr>
+              <w:pStyle w:val="TableBody"/>
+            </w:pPr>
+            <w:r>
+              <w:t xml:space="preserve">2026-09-28</w:t>
+            </w:r>
+          </w:p>
+        </w:tc>
+        <w:tc>
+          <w:tcPr>
+            <w:tcW w:w="1850" w:type="dxa"/>
+            <w:shd w:fill="F7FAF8"/>
+          </w:tcPr>
+          <w:p>
+            <w:pPr>
+              <w:pStyle w:val="TableBody"/>
+            </w:pPr>
+            <w:r>
+              <w:t xml:space="preserve">Added cross-domain operation lifecycle and exclusive restore maintenance.</w:t>
+            </w:r>
+          </w:p>
+        </w:tc>
+        <w:tc>
+          <w:tcPr>
+            <w:tcW w:w="6410" w:type="dxa"/>
+            <w:shd w:fill="F7FAF8"/>
+          </w:tcPr>
+          <w:p>
+            <w:pPr>
+              <w:pStyle w:val="TableBody"/>
+            </w:pPr>
+            <w:r>
+              <w:t xml:space="preserve">Whole-operation leases drain admitted mutations/cleanup, invalidate queued task passes, and authorize restore only under exclusive ownership. Persistent rollback sets survive catastrophic failure; the process stays locked. Added race/recovery tests and corrected restore documentation; schema v9 and backup format are unchanged.</w:t>
             </w:r>
           </w:p>
         </w:tc>

</xml_diff>

<commit_message>
feat: add vehicle fuel and charging tracking
</commit_message>
<xml_diff>
--- a/docs/LifePilot_Project_Guide.docx
+++ b/docs/LifePilot_Project_Guide.docx
@@ -33,7 +33,7 @@
         <w:spacing w:before="600"/>
       </w:pPr>
       <w:r>
-        <w:t xml:space="preserve">Last updated: 2026-09-28</w:t>
+        <w:t xml:space="preserve">Last updated: 2026-09-29</w:t>
       </w:r>
     </w:p>
     <w:p>
@@ -347,7 +347,7 @@
         <w:pStyle w:val="Normal"/>
       </w:pPr>
       <w:r>
-        <w:t xml:space="preserve">Last repository review: 2026-09-28. Source code is authoritative if this document becomes stale. This is a snapshot of the checked-out repository, not proof of behavior on an installed phone.</w:t>
+        <w:t xml:space="preserve">Last repository review: 2026-09-29. Source code is authoritative if this document becomes stale. This is a snapshot of the checked-out repository, not proof of behavior on an installed phone.</w:t>
       </w:r>
     </w:p>
     <w:p>
@@ -1221,7 +1221,7 @@
         <w:t xml:space="preserve">src/app/vehicle/module.tsx</w:t>
       </w:r>
       <w:r>
-        <w:t xml:space="preserve"> remains a placeholder route for some module keys; inspect actual route targets before describing a module as complete.</w:t>
+        <w:t xml:space="preserve"> redirects supported service, insurance and fuel module links to their dedicated routes; unknown keys show an unavailable state.</w:t>
       </w:r>
     </w:p>
     <w:p>
@@ -1443,27 +1443,141 @@
         <w:pStyle w:val="Normal"/>
       </w:pPr>
       <w:r>
-        <w:t xml:space="preserve">Fuel/charging logs and reports are </w:t>
+        <w:t xml:space="preserve">Fuel / Charging V1 Stage 1 data/domain foundation is implemented in </w:t>
+      </w:r>
+      <w:r>
+        <w:rPr>
+          <w:rStyle w:val="Code"/>
+        </w:rPr>
+        <w:t xml:space="preserve">vehicle-fuel.ts</w:t>
+      </w:r>
+      <w:r>
+        <w:t xml:space="preserve">, </w:t>
+      </w:r>
+      <w:r>
+        <w:rPr>
+          <w:rStyle w:val="Code"/>
+        </w:rPr>
+        <w:t xml:space="preserve">fuel-entry.ts</w:t>
+      </w:r>
+      <w:r>
+        <w:t xml:space="preserve"> and </w:t>
+      </w:r>
+      <w:r>
+        <w:rPr>
+          <w:rStyle w:val="Code"/>
+        </w:rPr>
+        <w:t xml:space="preserve">fuel-calculations.ts</w:t>
+      </w:r>
+      <w:r>
+        <w:t xml:space="preserve">: scoped CRUD/history/summaries, validation, lifecycle leases and conservative full-to-full calculations. Stage 2 UI is implemented: Vehicle Detail opens </w:t>
+      </w:r>
+      <w:r>
+        <w:rPr>
+          <w:rStyle w:val="Code"/>
+        </w:rPr>
+        <w:t xml:space="preserve">/vehicle/fuel</w:t>
+      </w:r>
+      <w:r>
+        <w:t xml:space="preserve"> with adaptive Fuel/Charging labels, dashboard summaries, recent entries, virtualized cursor history, details and validated add/edit/confirmed delete. The shared V2 controls preserve appearance support. Total paid remains authoritative; exact derived prices are previews, and efficiency displays only for valid dated intervals. Reports remain planned. Vehicle photo management works. General-purpose vehicle document uploads remain planned even though insurance/PUC document photos and service bill images are implemented. Older placeholder metadata for service and insurance does not override their implemented dedicated routes and repositories. Device behavior for current photo/document and notification flows still needs final verification.</w:t>
+      </w:r>
+    </w:p>
+    <w:p>
+      <w:pPr>
+        <w:pStyle w:val="Heading2"/>
+      </w:pPr>
+      <w:bookmarkStart w:id="69" w:name="section_9"/>
+      <w:r>
+        <w:t xml:space="preserve">8. Personal Expense Manager</w:t>
+      </w:r>
+      <w:bookmarkEnd w:id="69"/>
+    </w:p>
+    <w:p>
+      <w:pPr>
+        <w:pStyle w:val="Normal"/>
+      </w:pPr>
+      <w:r>
+        <w:rPr>
+          <w:rStyle w:val="Code"/>
+        </w:rPr>
+        <w:t xml:space="preserve">/personal</w:t>
+      </w:r>
+      <w:r>
+        <w:t xml:space="preserve"> displays a V2 selected-month dashboard with prominent balance, income, expenses, counts, category breakdowns, top spending, previous-month comparison, six-month trend, deterministic insights, and recent entries. Empty analytics use meaningful empty states instead of zero-only charts. Add/details/edit/confirmed delete support income and expense transactions, seeded typed categories, optional description/notes, and Cash, UPI, Credit Card, Debit Card, Bank Transfer, or Other payment method. History filters by type/month/category and uses a </w:t>
+      </w:r>
+      <w:r>
+        <w:rPr>
+          <w:rStyle w:val="Code"/>
+        </w:rPr>
+        <w:t xml:space="preserve">FlatList</w:t>
+      </w:r>
+      <w:r>
+        <w:t xml:space="preserve"> with 40-row keyset pages. Amounts are </w:t>
       </w:r>
       <w:r>
         <w:rPr>
           <w:b/>
         </w:rPr>
-        <w:t xml:space="preserve">not implemented</w:t>
-      </w:r>
-      <w:r>
-        <w:t xml:space="preserve">; the exposed Fuel / Charging destination intentionally shows the existing coming-later state. Vehicle photo management works. General-purpose vehicle document uploads remain planned even though insurance/PUC document photos and service bill images are implemented. Older placeholder metadata for service and insurance does not override their implemented dedicated routes and repositories. Device behavior for current photo/document and notification flows still needs final verification.</w:t>
+        <w:t xml:space="preserve">integer paise</w:t>
+      </w:r>
+      <w:r>
+        <w:t xml:space="preserve">, parsed without rounding; aggregate values use SQLite integer sums and decimal strings/BigInt in analytics. Dates are local </w:t>
+      </w:r>
+      <w:r>
+        <w:rPr>
+          <w:rStyle w:val="Code"/>
+        </w:rPr>
+        <w:t xml:space="preserve">YYYY-MM-DD</w:t>
+      </w:r>
+      <w:r>
+        <w:t xml:space="preserve">; timestamps are stored separately. Main files: </w:t>
+      </w:r>
+      <w:r>
+        <w:rPr>
+          <w:rStyle w:val="Code"/>
+        </w:rPr>
+        <w:t xml:space="preserve">src/database/personal*.ts</w:t>
+      </w:r>
+      <w:r>
+        <w:t xml:space="preserve">, </w:t>
+      </w:r>
+      <w:r>
+        <w:rPr>
+          <w:rStyle w:val="Code"/>
+        </w:rPr>
+        <w:t xml:space="preserve">src/features/personal/*</w:t>
+      </w:r>
+      <w:r>
+        <w:t xml:space="preserve">, </w:t>
+      </w:r>
+      <w:r>
+        <w:rPr>
+          <w:rStyle w:val="Code"/>
+        </w:rPr>
+        <w:t xml:space="preserve">src/app/personal/*</w:t>
+      </w:r>
+      <w:r>
+        <w:t xml:space="preserve">, </w:t>
+      </w:r>
+      <w:r>
+        <w:rPr>
+          <w:rStyle w:val="Code"/>
+        </w:rPr>
+        <w:t xml:space="preserve">src/components/personal/*</w:t>
+      </w:r>
+      <w:r>
+        <w:t xml:space="preserve">. Vehicle expenses remain separate unless a future deliberate architecture change is made. Custom category editing, budgets, recurring entries, and receipts are not implemented.</w:t>
       </w:r>
     </w:p>
     <w:p>
       <w:pPr>
         <w:pStyle w:val="Heading2"/>
       </w:pPr>
-      <w:bookmarkStart w:id="69" w:name="section_9"/>
-      <w:r>
-        <w:t xml:space="preserve">8. Personal Expense Manager</w:t>
-      </w:r>
-      <w:bookmarkEnd w:id="69"/>
+      <w:bookmarkStart w:id="71" w:name="section_10"/>
+      <w:r>
+        <w:t xml:space="preserve">9. Tasks / To-Do</w:t>
+      </w:r>
+      <w:bookmarkEnd w:id="71"/>
     </w:p>
     <w:p>
       <w:pPr>
@@ -1473,220 +1587,133 @@
         <w:rPr>
           <w:rStyle w:val="Code"/>
         </w:rPr>
-        <w:t xml:space="preserve">/personal</w:t>
-      </w:r>
-      <w:r>
-        <w:t xml:space="preserve"> displays a V2 selected-month dashboard with prominent balance, income, expenses, counts, category breakdowns, top spending, previous-month comparison, six-month trend, deterministic insights, and recent entries. Empty analytics use meaningful empty states instead of zero-only charts. Add/details/edit/confirmed delete support income and expense transactions, seeded typed categories, optional description/notes, and Cash, UPI, Credit Card, Debit Card, Bank Transfer, or Other payment method. History filters by type/month/category and uses a </w:t>
-      </w:r>
-      <w:r>
-        <w:rPr>
-          <w:rStyle w:val="Code"/>
-        </w:rPr>
-        <w:t xml:space="preserve">FlatList</w:t>
-      </w:r>
-      <w:r>
-        <w:t xml:space="preserve"> with 40-row keyset pages. Amounts are </w:t>
+        <w:t xml:space="preserve">/tasks</w:t>
+      </w:r>
+      <w:r>
+        <w:t xml:space="preserve"> uses a V2 task-first dashboard. Today, Upcoming and All remain top-level; Overdue, No due date, Completed, category and priority filters live in a compact filter panel with active-filter display and reset. Task cards show available due date/time, category, priority and completion state; empty views use </w:t>
+      </w:r>
+      <w:r>
+        <w:rPr>
+          <w:rStyle w:val="Code"/>
+        </w:rPr>
+        <w:t xml:space="preserve">EmptyState</w:t>
+      </w:r>
+      <w:r>
+        <w:t xml:space="preserve">; both dashboard and empty-state primary actions use the consistent </w:t>
+      </w:r>
+      <w:r>
+        <w:rPr>
+          <w:rStyle w:val="Code"/>
+        </w:rPr>
+        <w:t xml:space="preserve">+ Add Task</w:t>
+      </w:r>
+      <w:r>
+        <w:t xml:space="preserve"> presentation. Add/edit/details support title, optional description/category/date/time, low/medium/high priority, completion/reopen, confirmed deletion, and 40-row offset pages. Seeded categories are Personal, Work, Shopping, Home, and Other; there is no custom category editor. Dates are local </w:t>
+      </w:r>
+      <w:r>
+        <w:rPr>
+          <w:rStyle w:val="Code"/>
+        </w:rPr>
+        <w:t xml:space="preserve">YYYY-MM-DD</w:t>
+      </w:r>
+      <w:r>
+        <w:t xml:space="preserve">, time is optional </w:t>
+      </w:r>
+      <w:r>
+        <w:rPr>
+          <w:rStyle w:val="Code"/>
+        </w:rPr>
+        <w:t xml:space="preserve">HH:MM</w:t>
+      </w:r>
+      <w:r>
+        <w:t xml:space="preserve">, and reminders require both date and time. Completion stores a UTC timestamp; reopening clears it. Future valid reminders are scheduled locally and stale ones cancelled; past reminders are not scheduled on reopen. Main files: </w:t>
+      </w:r>
+      <w:r>
+        <w:rPr>
+          <w:rStyle w:val="Code"/>
+        </w:rPr>
+        <w:t xml:space="preserve">src/database/tasks.ts</w:t>
+      </w:r>
+      <w:r>
+        <w:t xml:space="preserve">, </w:t>
+      </w:r>
+      <w:r>
+        <w:rPr>
+          <w:rStyle w:val="Code"/>
+        </w:rPr>
+        <w:t xml:space="preserve">src/features/tasks/*</w:t>
+      </w:r>
+      <w:r>
+        <w:t xml:space="preserve">, </w:t>
+      </w:r>
+      <w:r>
+        <w:rPr>
+          <w:rStyle w:val="Code"/>
+        </w:rPr>
+        <w:t xml:space="preserve">src/app/tasks/*</w:t>
+      </w:r>
+      <w:r>
+        <w:t xml:space="preserve">, </w:t>
+      </w:r>
+      <w:r>
+        <w:rPr>
+          <w:rStyle w:val="Code"/>
+        </w:rPr>
+        <w:t xml:space="preserve">src/components/tasks/*</w:t>
+      </w:r>
+      <w:r>
+        <w:t xml:space="preserve">.</w:t>
+      </w:r>
+    </w:p>
+    <w:p>
+      <w:pPr>
+        <w:pStyle w:val="Heading2"/>
+      </w:pPr>
+      <w:bookmarkStart w:id="73" w:name="section_11"/>
+      <w:r>
+        <w:t xml:space="preserve">10. Database Architecture</w:t>
+      </w:r>
+      <w:bookmarkEnd w:id="73"/>
+    </w:p>
+    <w:p>
+      <w:pPr>
+        <w:pStyle w:val="Normal"/>
+      </w:pPr>
+      <w:r>
+        <w:rPr>
+          <w:rStyle w:val="Code"/>
+        </w:rPr>
+        <w:t xml:space="preserve">src/database/migrate.ts</w:t>
+      </w:r>
+      <w:r>
+        <w:t xml:space="preserve"> is the authoritative schema history. It enables WAL and foreign keys, reads </w:t>
+      </w:r>
+      <w:r>
+        <w:rPr>
+          <w:rStyle w:val="Code"/>
+        </w:rPr>
+        <w:t xml:space="preserve">PRAGMA user_version</w:t>
+      </w:r>
+      <w:r>
+        <w:t xml:space="preserve">, rejects a database newer than supported, and applies each missing version in a transaction. Current version: </w:t>
       </w:r>
       <w:r>
         <w:rPr>
           <w:b/>
         </w:rPr>
-        <w:t xml:space="preserve">integer paise</w:t>
-      </w:r>
-      <w:r>
-        <w:t xml:space="preserve">, parsed without rounding; aggregate values use SQLite integer sums and decimal strings/BigInt in analytics. Dates are local </w:t>
-      </w:r>
-      <w:r>
-        <w:rPr>
-          <w:rStyle w:val="Code"/>
-        </w:rPr>
-        <w:t xml:space="preserve">YYYY-MM-DD</w:t>
-      </w:r>
-      <w:r>
-        <w:t xml:space="preserve">; timestamps are stored separately. Main files: </w:t>
-      </w:r>
-      <w:r>
-        <w:rPr>
-          <w:rStyle w:val="Code"/>
-        </w:rPr>
-        <w:t xml:space="preserve">src/database/personal*.ts</w:t>
-      </w:r>
-      <w:r>
-        <w:t xml:space="preserve">, </w:t>
-      </w:r>
-      <w:r>
-        <w:rPr>
-          <w:rStyle w:val="Code"/>
-        </w:rPr>
-        <w:t xml:space="preserve">src/features/personal/*</w:t>
-      </w:r>
-      <w:r>
-        <w:t xml:space="preserve">, </w:t>
-      </w:r>
-      <w:r>
-        <w:rPr>
-          <w:rStyle w:val="Code"/>
-        </w:rPr>
-        <w:t xml:space="preserve">src/app/personal/*</w:t>
-      </w:r>
-      <w:r>
-        <w:t xml:space="preserve">, </w:t>
-      </w:r>
-      <w:r>
-        <w:rPr>
-          <w:rStyle w:val="Code"/>
-        </w:rPr>
-        <w:t xml:space="preserve">src/components/personal/*</w:t>
-      </w:r>
-      <w:r>
-        <w:t xml:space="preserve">. Vehicle expenses remain separate unless a future deliberate architecture change is made. Custom category editing, budgets, recurring entries, and receipts are not implemented.</w:t>
-      </w:r>
-    </w:p>
-    <w:p>
-      <w:pPr>
-        <w:pStyle w:val="Heading2"/>
-      </w:pPr>
-      <w:bookmarkStart w:id="71" w:name="section_10"/>
-      <w:r>
-        <w:t xml:space="preserve">9. Tasks / To-Do</w:t>
-      </w:r>
-      <w:bookmarkEnd w:id="71"/>
-    </w:p>
-    <w:p>
-      <w:pPr>
-        <w:pStyle w:val="Normal"/>
-      </w:pPr>
-      <w:r>
-        <w:rPr>
-          <w:rStyle w:val="Code"/>
-        </w:rPr>
-        <w:t xml:space="preserve">/tasks</w:t>
-      </w:r>
-      <w:r>
-        <w:t xml:space="preserve"> uses a V2 task-first dashboard. Today, Upcoming and All remain top-level; Overdue, No due date, Completed, category and priority filters live in a compact filter panel with active-filter display and reset. Task cards show available due date/time, category, priority and completion state; empty views use </w:t>
-      </w:r>
-      <w:r>
-        <w:rPr>
-          <w:rStyle w:val="Code"/>
-        </w:rPr>
-        <w:t xml:space="preserve">EmptyState</w:t>
-      </w:r>
-      <w:r>
-        <w:t xml:space="preserve">; both dashboard and empty-state primary actions use the consistent </w:t>
-      </w:r>
-      <w:r>
-        <w:rPr>
-          <w:rStyle w:val="Code"/>
-        </w:rPr>
-        <w:t xml:space="preserve">+ Add Task</w:t>
-      </w:r>
-      <w:r>
-        <w:t xml:space="preserve"> presentation. Add/edit/details support title, optional description/category/date/time, low/medium/high priority, completion/reopen, confirmed deletion, and 40-row offset pages. Seeded categories are Personal, Work, Shopping, Home, and Other; there is no custom category editor. Dates are local </w:t>
-      </w:r>
-      <w:r>
-        <w:rPr>
-          <w:rStyle w:val="Code"/>
-        </w:rPr>
-        <w:t xml:space="preserve">YYYY-MM-DD</w:t>
-      </w:r>
-      <w:r>
-        <w:t xml:space="preserve">, time is optional </w:t>
-      </w:r>
-      <w:r>
-        <w:rPr>
-          <w:rStyle w:val="Code"/>
-        </w:rPr>
-        <w:t xml:space="preserve">HH:MM</w:t>
-      </w:r>
-      <w:r>
-        <w:t xml:space="preserve">, and reminders require both date and time. Completion stores a UTC timestamp; reopening clears it. Future valid reminders are scheduled locally and stale ones cancelled; past reminders are not scheduled on reopen. Main files: </w:t>
-      </w:r>
-      <w:r>
-        <w:rPr>
-          <w:rStyle w:val="Code"/>
-        </w:rPr>
-        <w:t xml:space="preserve">src/database/tasks.ts</w:t>
-      </w:r>
-      <w:r>
-        <w:t xml:space="preserve">, </w:t>
-      </w:r>
-      <w:r>
-        <w:rPr>
-          <w:rStyle w:val="Code"/>
-        </w:rPr>
-        <w:t xml:space="preserve">src/features/tasks/*</w:t>
-      </w:r>
-      <w:r>
-        <w:t xml:space="preserve">, </w:t>
-      </w:r>
-      <w:r>
-        <w:rPr>
-          <w:rStyle w:val="Code"/>
-        </w:rPr>
-        <w:t xml:space="preserve">src/app/tasks/*</w:t>
-      </w:r>
-      <w:r>
-        <w:t xml:space="preserve">, </w:t>
-      </w:r>
-      <w:r>
-        <w:rPr>
-          <w:rStyle w:val="Code"/>
-        </w:rPr>
-        <w:t xml:space="preserve">src/components/tasks/*</w:t>
-      </w:r>
-      <w:r>
-        <w:t xml:space="preserve">.</w:t>
-      </w:r>
-    </w:p>
-    <w:p>
-      <w:pPr>
-        <w:pStyle w:val="Heading2"/>
-      </w:pPr>
-      <w:bookmarkStart w:id="73" w:name="section_11"/>
-      <w:r>
-        <w:t xml:space="preserve">10. Database Architecture</w:t>
-      </w:r>
-      <w:bookmarkEnd w:id="73"/>
-    </w:p>
-    <w:p>
-      <w:pPr>
-        <w:pStyle w:val="Normal"/>
-      </w:pPr>
-      <w:r>
-        <w:rPr>
-          <w:rStyle w:val="Code"/>
-        </w:rPr>
-        <w:t xml:space="preserve">src/database/migrate.ts</w:t>
-      </w:r>
-      <w:r>
-        <w:t xml:space="preserve"> is the authoritative schema history. It enables WAL and foreign keys, reads </w:t>
-      </w:r>
-      <w:r>
-        <w:rPr>
-          <w:rStyle w:val="Code"/>
-        </w:rPr>
-        <w:t xml:space="preserve">PRAGMA user_version</w:t>
-      </w:r>
-      <w:r>
-        <w:t xml:space="preserve">, rejects a database newer than supported, and applies each missing version in a transaction. Current version: </w:t>
-      </w:r>
-      <w:r>
-        <w:rPr>
-          <w:b/>
-        </w:rPr>
-        <w:t xml:space="preserve">9</w:t>
-      </w:r>
-      <w:r>
-        <w:t xml:space="preserve">. There is no separate migration folder. Tasks and </w:t>
-      </w:r>
-      <w:r>
-        <w:rPr>
-          <w:rStyle w:val="Code"/>
-        </w:rPr>
-        <w:t xml:space="preserve">task_categories</w:t>
-      </w:r>
-      <w:r>
-        <w:t xml:space="preserve"> are the latest schema addition at version 9. The UI/UX V2 work added no migration and made no database schema change.</w:t>
+        <w:t xml:space="preserve">10</w:t>
+      </w:r>
+      <w:r>
+        <w:t xml:space="preserve">. There is no separate migration folder. Version 10 adds </w:t>
+      </w:r>
+      <w:r>
+        <w:rPr>
+          <w:rStyle w:val="Code"/>
+        </w:rPr>
+        <w:t xml:space="preserve">vehicle_fuel_entries</w:t>
+      </w:r>
+      <w:r>
+        <w:t xml:space="preserve"> and its vehicle/date/id history index without changing existing tables or rows. The UI/UX V2 work added no migration and made no database schema change.</w:t>
       </w:r>
     </w:p>
     <w:tbl>
@@ -2183,6 +2210,50 @@
           </w:p>
         </w:tc>
       </w:tr>
+      <w:tr>
+        <w:tc>
+          <w:tcPr>
+            <w:tcW w:w="1100" w:type="dxa"/>
+            <w:shd w:fill="F7FAF8"/>
+          </w:tcPr>
+          <w:p>
+            <w:pPr>
+              <w:pStyle w:val="TableBody"/>
+            </w:pPr>
+            <w:r>
+              <w:t xml:space="preserve">10</w:t>
+            </w:r>
+          </w:p>
+        </w:tc>
+        <w:tc>
+          <w:tcPr>
+            <w:tcW w:w="1850" w:type="dxa"/>
+            <w:shd w:fill="F7FAF8"/>
+          </w:tcPr>
+          <w:p>
+            <w:pPr>
+              <w:pStyle w:val="TableBody"/>
+            </w:pPr>
+            <w:r>
+              <w:t xml:space="preserve">Fuel / Charging foundation</w:t>
+            </w:r>
+          </w:p>
+        </w:tc>
+        <w:tc>
+          <w:tcPr>
+            <w:tcW w:w="6410" w:type="dxa"/>
+            <w:shd w:fill="F7FAF8"/>
+          </w:tcPr>
+          <w:p>
+            <w:pPr>
+              <w:pStyle w:val="TableBody"/>
+            </w:pPr>
+            <w:r>
+              <w:t xml:space="preserve">Discriminated refuel/charge records, integer paise/metres/milli-units, vehicle cascade FK and history index.</w:t>
+            </w:r>
+          </w:p>
+        </w:tc>
+      </w:tr>
     </w:tbl>
     <w:p>
       <w:pPr>
@@ -2323,6 +2394,23 @@
         <w:pStyle w:val="Normal"/>
       </w:pPr>
       <w:r>
+        <w:t xml:space="preserve">Fuel entry costs and optional quoted rates use integer paise; quantities use thousandths of L/kg/kWh and odometers use integer metres. Fuel saves raise a greater vehicle odometer in the same transaction/lease; lower readings and deletion never rewind it. Summary totals are decimal strings and calculated ratios remain exact until display. See </w:t>
+      </w:r>
+      <w:r>
+        <w:rPr>
+          <w:rStyle w:val="Code"/>
+        </w:rPr>
+        <w:t xml:space="preserve">docs/FUEL_CHARGING.md</w:t>
+      </w:r>
+      <w:r>
+        <w:t xml:space="preserve"> for APIs and full-to-full validity rules.</w:t>
+      </w:r>
+    </w:p>
+    <w:p>
+      <w:pPr>
+        <w:pStyle w:val="Normal"/>
+      </w:pPr>
+      <w:r>
         <w:t xml:space="preserve">Personal transaction </w:t>
       </w:r>
       <w:r>
@@ -2366,11 +2454,11 @@
       <w:pPr>
         <w:pStyle w:val="Heading2"/>
       </w:pPr>
-      <w:bookmarkStart w:id="78" w:name="section_12"/>
+      <w:bookmarkStart w:id="79" w:name="section_12"/>
       <w:r>
         <w:t xml:space="preserve">11. File Storage</w:t>
       </w:r>
-      <w:bookmarkEnd w:id="78"/>
+      <w:bookmarkEnd w:id="79"/>
     </w:p>
     <w:p>
       <w:pPr>
@@ -2438,11 +2526,11 @@
       <w:pPr>
         <w:pStyle w:val="Heading2"/>
       </w:pPr>
-      <w:bookmarkStart w:id="80" w:name="section_13"/>
+      <w:bookmarkStart w:id="81" w:name="section_13"/>
       <w:r>
         <w:t xml:space="preserve">12. Notifications</w:t>
       </w:r>
-      <w:bookmarkEnd w:id="80"/>
+      <w:bookmarkEnd w:id="81"/>
     </w:p>
     <w:p>
       <w:pPr>
@@ -2553,11 +2641,11 @@
       <w:pPr>
         <w:pStyle w:val="Heading2"/>
       </w:pPr>
-      <w:bookmarkStart w:id="84" w:name="section_14"/>
+      <w:bookmarkStart w:id="85" w:name="section_14"/>
       <w:r>
         <w:t xml:space="preserve">12A. Backup &amp; Restore V1</w:t>
       </w:r>
-      <w:bookmarkEnd w:id="84"/>
+      <w:bookmarkEnd w:id="85"/>
     </w:p>
     <w:p>
       <w:pPr>
@@ -2600,7 +2688,7 @@
         <w:t xml:space="preserve">vehicle-photos</w:t>
       </w:r>
       <w:r>
-        <w:t xml:space="preserve"> root, a versioned manifest and SHA-256 plus byte size for every entry. This covers vehicle records/photos, service history/bills, insurance/PUC records and images, Personal Expenses, Tasks, categories and SQLite reminder preferences. Cache, staging, generated backups, credentials, build files, native notification inventory/permissions/channels and the separate device-local appearance preference database are excluded.</w:t>
+        <w:t xml:space="preserve"> root, a versioned manifest and SHA-256 plus byte size for every entry. This covers fuel/charging records and vehicle records/photos, service history/bills, insurance/PUC records and images, Personal Expenses, Tasks, categories and SQLite reminder preferences. Cache, staging, generated backups, credentials, build files, native notification inventory/permissions/channels and the separate device-local appearance preference database are excluded.</w:t>
       </w:r>
     </w:p>
     <w:p>
@@ -2608,7 +2696,7 @@
         <w:pStyle w:val="Normal"/>
       </w:pPr>
       <w:r>
-        <w:t xml:space="preserve">Restore inspection verifies structure, paths, counts, Base64 sizes, checksums, SQLite integrity and actual schema without changing active data. Schema v9 restores directly; older supported schemas use the existing migration function in isolation; newer schemas are rejected. Before replacement, the engine snapshots the current database and owned file tree. It writes through Expo SQLite's online backup API and replacement-restores only the owned file root, with database/file rollback on failure. The root coordinator synchronously closes mutation admission, unmounts navigation/providers and awaits the central activity drain before authorizing replacement. Recoverable failures release ownership; successful restore keeps the restart-required lock. Catastrophic rollback failure retains exclusive ownership and a recovery screen that blocks Android Back and instructs the user to stop using LifePilot and close it without claiming that reopening repairs data.</w:t>
+        <w:t xml:space="preserve">Restore inspection verifies structure, paths, counts, Base64 sizes, checksums, SQLite integrity and actual schema without changing active data. Schema v10 restores directly; v9 upgrades add the empty fuel table; older supported schemas use the existing migration function in isolation; newer schemas are rejected. Before replacement, the engine snapshots the current database and owned file tree. It writes through Expo SQLite's online backup API and replacement-restores only the owned file root, with database/file rollback on failure. The root coordinator synchronously closes mutation admission, unmounts navigation/providers and awaits the central activity drain before authorizing replacement. Recoverable failures release ownership; successful restore keeps the restart-required lock. Catastrophic rollback failure retains exclusive ownership and a recovery screen that blocks Android Back and instructs the user to stop using LifePilot and close it without claiming that reopening repairs data.</w:t>
       </w:r>
     </w:p>
     <w:p>
@@ -2632,11 +2720,11 @@
       <w:pPr>
         <w:pStyle w:val="Heading3"/>
       </w:pPr>
-      <w:bookmarkStart w:id="88" w:name="section_15"/>
+      <w:bookmarkStart w:id="89" w:name="section_15"/>
       <w:r>
         <w:t xml:space="preserve">Operation ownership and recovery persistence</w:t>
       </w:r>
-      <w:bookmarkEnd w:id="88"/>
+      <w:bookmarkEnd w:id="89"/>
     </w:p>
     <w:p>
       <w:pPr>
@@ -2700,11 +2788,11 @@
       <w:pPr>
         <w:pStyle w:val="Heading2"/>
       </w:pPr>
-      <w:bookmarkStart w:id="91" w:name="section_16"/>
+      <w:bookmarkStart w:id="92" w:name="section_16"/>
       <w:r>
         <w:t xml:space="preserve">13. Testing</w:t>
       </w:r>
-      <w:bookmarkEnd w:id="91"/>
+      <w:bookmarkEnd w:id="92"/>
     </w:p>
     <w:p>
       <w:pPr>
@@ -2780,11 +2868,11 @@
       <w:pPr>
         <w:pStyle w:val="Heading2"/>
       </w:pPr>
-      <w:bookmarkStart w:id="94" w:name="section_17"/>
+      <w:bookmarkStart w:id="95" w:name="section_17"/>
       <w:r>
         <w:t xml:space="preserve">14. Development Environment</w:t>
       </w:r>
-      <w:bookmarkEnd w:id="94"/>
+      <w:bookmarkEnd w:id="95"/>
     </w:p>
     <w:p>
       <w:pPr>
@@ -2834,11 +2922,11 @@
       <w:pPr>
         <w:pStyle w:val="Heading2"/>
       </w:pPr>
-      <w:bookmarkStart w:id="96" w:name="section_18"/>
+      <w:bookmarkStart w:id="97" w:name="section_18"/>
       <w:r>
         <w:t xml:space="preserve">15. Git Workflow</w:t>
       </w:r>
-      <w:bookmarkEnd w:id="96"/>
+      <w:bookmarkEnd w:id="97"/>
     </w:p>
     <w:p>
       <w:pPr>
@@ -2915,11 +3003,11 @@
       <w:pPr>
         <w:pStyle w:val="Heading2"/>
       </w:pPr>
-      <w:bookmarkStart w:id="98" w:name="section_19"/>
+      <w:bookmarkStart w:id="99" w:name="section_19"/>
       <w:r>
         <w:t xml:space="preserve">16. Android / EAS Build System</w:t>
       </w:r>
-      <w:bookmarkEnd w:id="98"/>
+      <w:bookmarkEnd w:id="99"/>
     </w:p>
     <w:p>
       <w:pPr>
@@ -3076,11 +3164,11 @@
       <w:pPr>
         <w:pStyle w:val="Heading2"/>
       </w:pPr>
-      <w:bookmarkStart w:id="101" w:name="section_20"/>
+      <w:bookmarkStart w:id="102" w:name="section_20"/>
       <w:r>
         <w:t xml:space="preserve">17. APK Update Safety</w:t>
       </w:r>
-      <w:bookmarkEnd w:id="101"/>
+      <w:bookmarkEnd w:id="102"/>
     </w:p>
     <w:p>
       <w:pPr>
@@ -3148,11 +3236,11 @@
       <w:pPr>
         <w:pStyle w:val="Heading2"/>
       </w:pPr>
-      <w:bookmarkStart w:id="103" w:name="section_21"/>
+      <w:bookmarkStart w:id="104" w:name="section_21"/>
       <w:r>
         <w:t xml:space="preserve">18. Known Issues</w:t>
       </w:r>
-      <w:bookmarkEnd w:id="103"/>
+      <w:bookmarkEnd w:id="104"/>
     </w:p>
     <w:tbl>
       <w:tblPr>
@@ -3477,6 +3565,61 @@
               <w:pStyle w:val="TableBody"/>
             </w:pPr>
             <w:r>
+              <w:t xml:space="preserve">Needs device verification</w:t>
+            </w:r>
+          </w:p>
+        </w:tc>
+        <w:tc>
+          <w:tcPr>
+            <w:tcW w:w="1900" w:type="dxa"/>
+          </w:tcPr>
+          <w:p>
+            <w:pPr>
+              <w:pStyle w:val="TableBody"/>
+            </w:pPr>
+            <w:r>
+              <w:t xml:space="preserve">Fuel / Charging</w:t>
+            </w:r>
+          </w:p>
+        </w:tc>
+        <w:tc>
+          <w:tcPr>
+            <w:tcW w:w="3500" w:type="dxa"/>
+          </w:tcPr>
+          <w:p>
+            <w:pPr>
+              <w:pStyle w:val="TableBody"/>
+            </w:pPr>
+            <w:r>
+              <w:t xml:space="preserve">Schema v10 foundation and Stage 2 UI are implemented with SQLite/component/lifecycle/backup tests; no native visual or Android testing performed.</w:t>
+            </w:r>
+          </w:p>
+        </w:tc>
+        <w:tc>
+          <w:tcPr>
+            <w:tcW w:w="2360" w:type="dxa"/>
+          </w:tcPr>
+          <w:p>
+            <w:pPr>
+              <w:pStyle w:val="TableBody"/>
+            </w:pPr>
+            <w:r>
+              <w:t xml:space="preserve">Verify add/edit/history/details, units, keyboard/Back, themes/accessibility, migration, odometer and restore behavior on preserved installed data.</w:t>
+            </w:r>
+          </w:p>
+        </w:tc>
+      </w:tr>
+      <w:tr>
+        <w:tc>
+          <w:tcPr>
+            <w:tcW w:w="1600" w:type="dxa"/>
+            <w:shd w:fill="F7FAF8"/>
+          </w:tcPr>
+          <w:p>
+            <w:pPr>
+              <w:pStyle w:val="TableBody"/>
+            </w:pPr>
+            <w:r>
               <w:t xml:space="preserve">Open documentation debt</w:t>
             </w:r>
           </w:p>
@@ -3484,6 +3627,7 @@
         <w:tc>
           <w:tcPr>
             <w:tcW w:w="1900" w:type="dxa"/>
+            <w:shd w:fill="F7FAF8"/>
           </w:tcPr>
           <w:p>
             <w:pPr>
@@ -3497,19 +3641,21 @@
         <w:tc>
           <w:tcPr>
             <w:tcW w:w="3500" w:type="dxa"/>
-          </w:tcPr>
-          <w:p>
-            <w:pPr>
-              <w:pStyle w:val="TableBody"/>
-            </w:pPr>
-            <w:r>
-              <w:t xml:space="preserve">README is starter text; Fuel / Charging remains a coming-later route while service and insurance use dedicated implemented routes.</w:t>
+            <w:shd w:fill="F7FAF8"/>
+          </w:tcPr>
+          <w:p>
+            <w:pPr>
+              <w:pStyle w:val="TableBody"/>
+            </w:pPr>
+            <w:r>
+              <w:t xml:space="preserve">README is starter text; some historical module metadata for service and insurance remains stale, though their dedicated routes are implemented.</w:t>
             </w:r>
           </w:p>
         </w:tc>
         <w:tc>
           <w:tcPr>
             <w:tcW w:w="2360" w:type="dxa"/>
+            <w:shd w:fill="F7FAF8"/>
           </w:tcPr>
           <w:p>
             <w:pPr>
@@ -3526,11 +3672,11 @@
       <w:pPr>
         <w:pStyle w:val="Heading2"/>
       </w:pPr>
-      <w:bookmarkStart w:id="105" w:name="section_22"/>
+      <w:bookmarkStart w:id="106" w:name="section_22"/>
       <w:r>
         <w:t xml:space="preserve">19. Future Roadmap</w:t>
       </w:r>
-      <w:bookmarkEnd w:id="105"/>
+      <w:bookmarkEnd w:id="106"/>
     </w:p>
     <w:p>
       <w:pPr>
@@ -3545,7 +3691,7 @@
         <w:pStyle w:val="Normal"/>
       </w:pPr>
       <w:r>
-        <w:t xml:space="preserve">Other planned or future candidates are fuel/charging logs and reports; general vehicle document uploads; personal budgets, recurring entries, receipts and custom category editing; and task recurring items, subtasks, custom categories and attachments. These are </w:t>
+        <w:t xml:space="preserve">Fuel / Charging Stages 1 and 2 are implemented; reports remain planned. Other planned or future candidates are general vehicle document uploads; personal budgets, recurring entries, receipts and custom category editing; and task recurring items, subtasks, custom categories and attachments. These are </w:t>
       </w:r>
       <w:r>
         <w:rPr>
@@ -3561,11 +3707,11 @@
       <w:pPr>
         <w:pStyle w:val="Heading2"/>
       </w:pPr>
-      <w:bookmarkStart w:id="108" w:name="section_23"/>
+      <w:bookmarkStart w:id="109" w:name="section_23"/>
       <w:r>
         <w:t xml:space="preserve">20. Important Files</w:t>
       </w:r>
-      <w:bookmarkEnd w:id="108"/>
+      <w:bookmarkEnd w:id="109"/>
     </w:p>
     <w:tbl>
       <w:tblPr>
@@ -3788,7 +3934,7 @@
               <w:rPr>
                 <w:rStyle w:val="Code"/>
               </w:rPr>
-              <w:t xml:space="preserve">src/database/{vehicles,vehicle-photos,vehicle-services,vehicle-coverage,reminders}.ts</w:t>
+              <w:t xml:space="preserve">src/database/{vehicles,vehicle-photos,vehicle-services,vehicle-coverage,vehicle-fuel,reminders}.ts</w:t>
             </w:r>
           </w:p>
         </w:tc>
@@ -4007,6 +4153,38 @@
               <w:rPr>
                 <w:rStyle w:val="Code"/>
               </w:rPr>
+              <w:t xml:space="preserve">docs/FUEL_CHARGING.md</w:t>
+            </w:r>
+          </w:p>
+        </w:tc>
+        <w:tc>
+          <w:tcPr>
+            <w:tcW w:w="5760" w:type="dxa"/>
+          </w:tcPr>
+          <w:p>
+            <w:pPr>
+              <w:pStyle w:val="TableBody"/>
+            </w:pPr>
+            <w:r>
+              <w:t xml:space="preserve">Fuel APIs, units, calculation assumptions, Stage 2 UI and manual checks.</w:t>
+            </w:r>
+          </w:p>
+        </w:tc>
+      </w:tr>
+      <w:tr>
+        <w:tc>
+          <w:tcPr>
+            <w:tcW w:w="3600" w:type="dxa"/>
+            <w:shd w:fill="F7FAF8"/>
+          </w:tcPr>
+          <w:p>
+            <w:pPr>
+              <w:pStyle w:val="TableBody"/>
+            </w:pPr>
+            <w:r>
+              <w:rPr>
+                <w:rStyle w:val="Code"/>
+              </w:rPr>
               <w:t xml:space="preserve">scripts/test-*.cjs</w:t>
             </w:r>
           </w:p>
@@ -4014,6 +4192,7 @@
         <w:tc>
           <w:tcPr>
             <w:tcW w:w="5760" w:type="dxa"/>
+            <w:shd w:fill="F7FAF8"/>
           </w:tcPr>
           <w:p>
             <w:pPr>
@@ -4029,7 +4208,6 @@
         <w:tc>
           <w:tcPr>
             <w:tcW w:w="3600" w:type="dxa"/>
-            <w:shd w:fill="F7FAF8"/>
           </w:tcPr>
           <w:p>
             <w:pPr>
@@ -4055,7 +4233,6 @@
         <w:tc>
           <w:tcPr>
             <w:tcW w:w="5760" w:type="dxa"/>
-            <w:shd w:fill="F7FAF8"/>
           </w:tcPr>
           <w:p>
             <w:pPr>
@@ -4071,6 +4248,7 @@
         <w:tc>
           <w:tcPr>
             <w:tcW w:w="3600" w:type="dxa"/>
+            <w:shd w:fill="F7FAF8"/>
           </w:tcPr>
           <w:p>
             <w:pPr>
@@ -4096,6 +4274,7 @@
         <w:tc>
           <w:tcPr>
             <w:tcW w:w="5760" w:type="dxa"/>
+            <w:shd w:fill="F7FAF8"/>
           </w:tcPr>
           <w:p>
             <w:pPr>
@@ -4111,7 +4290,6 @@
         <w:tc>
           <w:tcPr>
             <w:tcW w:w="3600" w:type="dxa"/>
-            <w:shd w:fill="F7FAF8"/>
           </w:tcPr>
           <w:p>
             <w:pPr>
@@ -4146,7 +4324,6 @@
         <w:tc>
           <w:tcPr>
             <w:tcW w:w="5760" w:type="dxa"/>
-            <w:shd w:fill="F7FAF8"/>
           </w:tcPr>
           <w:p>
             <w:pPr>
@@ -4163,11 +4340,11 @@
       <w:pPr>
         <w:pStyle w:val="Heading2"/>
       </w:pPr>
-      <w:bookmarkStart w:id="110" w:name="section_24"/>
+      <w:bookmarkStart w:id="111" w:name="section_24"/>
       <w:r>
         <w:t xml:space="preserve">21. Important Technical Decisions</w:t>
       </w:r>
-      <w:bookmarkEnd w:id="110"/>
+      <w:bookmarkEnd w:id="111"/>
     </w:p>
     <w:p>
       <w:pPr>
@@ -4670,11 +4847,11 @@
       <w:pPr>
         <w:pStyle w:val="Heading2"/>
       </w:pPr>
-      <w:bookmarkStart w:id="113" w:name="section_25"/>
+      <w:bookmarkStart w:id="114" w:name="section_25"/>
       <w:r>
         <w:t xml:space="preserve">22. Instructions for Future LLMs</w:t>
       </w:r>
-      <w:bookmarkEnd w:id="113"/>
+      <w:bookmarkEnd w:id="114"/>
     </w:p>
     <w:p>
       <w:pPr>
@@ -4688,11 +4865,11 @@
       <w:pPr>
         <w:pStyle w:val="Heading2"/>
       </w:pPr>
-      <w:bookmarkStart w:id="115" w:name="section_26"/>
+      <w:bookmarkStart w:id="116" w:name="section_26"/>
       <w:r>
         <w:t xml:space="preserve">23. Current Project State</w:t>
       </w:r>
-      <w:bookmarkEnd w:id="115"/>
+      <w:bookmarkEnd w:id="116"/>
     </w:p>
     <w:p>
       <w:pPr>
@@ -4709,7 +4886,7 @@
         <w:t xml:space="preserve">Completed in source:</w:t>
       </w:r>
       <w:r>
-        <w:t xml:space="preserve"> UI/UX V2 across Home, Tasks, Garage/Vehicle Detail, Personal Expenses, Vehicle Reminders/Settings, Settings/About and remaining vehicle forms; vehicle CRUD/photos/services/coverage; personal transactions and analytics; tasks; appearance themes; local reminder scheduling; Expo Go notification isolation; Backup &amp; Restore V1 create/inspect/replacement/rollback UI and engines, shared mutation leases/exclusive maintenance and persistent catastrophic recovery material; migrations through v9; and regression scripts.</w:t>
+        <w:t xml:space="preserve"> UI/UX V2 across Home, Tasks, Garage/Vehicle Detail, Personal Expenses, Vehicle Reminders/Settings, Settings/About and remaining vehicle forms; vehicle CRUD/photos/services/coverage; personal transactions and analytics; tasks; appearance themes; local reminder scheduling; Expo Go notification isolation; Backup &amp; Restore V1 create/inspect/replacement/rollback UI and engines, shared mutation leases/exclusive maintenance and persistent catastrophic recovery material; Fuel / Charging Stage 1 foundation and Stage 2 dashboard/forms/history/details; migrations through v10; and regression scripts.</w:t>
       </w:r>
     </w:p>
     <w:p>
@@ -4763,18 +4940,18 @@
         <w:t xml:space="preserve">Next:</w:t>
       </w:r>
       <w:r>
-        <w:t xml:space="preserve"> complete real-device Backup &amp; Restore safety tests (including in-flight operations, rollback failure and process interruption) and final V2 regression testing. Fuel/charging, general document uploads and cloud account/sync remain future work.</w:t>
+        <w:t xml:space="preserve"> complete real-device Backup &amp; Restore safety tests (including in-flight operations, rollback failure and process interruption) and final V2 regression testing. Fuel/charging device validation and future reports, general document uploads and cloud account/sync remain future work.</w:t>
       </w:r>
     </w:p>
     <w:p>
       <w:pPr>
         <w:pStyle w:val="Heading2"/>
       </w:pPr>
-      <w:bookmarkStart w:id="120" w:name="section_27"/>
+      <w:bookmarkStart w:id="121" w:name="section_27"/>
       <w:r>
         <w:t xml:space="preserve">24. Changelog</w:t>
       </w:r>
-      <w:bookmarkEnd w:id="120"/>
+      <w:bookmarkEnd w:id="121"/>
     </w:p>
     <w:tbl>
       <w:tblPr>
@@ -5145,6 +5322,91 @@
             </w:pPr>
             <w:r>
               <w:t xml:space="preserve">Adds checksummed portable packages, safe inspection, isolated migration, coordinated replacement/rollback, cross-device path rebasing and restart locking without a schema or dependency change.</w:t>
+            </w:r>
+          </w:p>
+        </w:tc>
+      </w:tr>
+      <w:tr>
+        <w:tc>
+          <w:tcPr>
+            <w:tcW w:w="1100" w:type="dxa"/>
+            <w:shd w:fill="F7FAF8"/>
+          </w:tcPr>
+          <w:p>
+            <w:pPr>
+              <w:pStyle w:val="TableBody"/>
+            </w:pPr>
+            <w:r>
+              <w:t xml:space="preserve">2026-09-29</w:t>
+            </w:r>
+          </w:p>
+        </w:tc>
+        <w:tc>
+          <w:tcPr>
+            <w:tcW w:w="1850" w:type="dxa"/>
+            <w:shd w:fill="F7FAF8"/>
+          </w:tcPr>
+          <w:p>
+            <w:pPr>
+              <w:pStyle w:val="TableBody"/>
+            </w:pPr>
+            <w:r>
+              <w:t xml:space="preserve">Implemented Fuel / Charging V1 Stage 2 UI.</w:t>
+            </w:r>
+          </w:p>
+        </w:tc>
+        <w:tc>
+          <w:tcPr>
+            <w:tcW w:w="6410" w:type="dxa"/>
+            <w:shd w:fill="F7FAF8"/>
+          </w:tcPr>
+          <w:p>
+            <w:pPr>
+              <w:pStyle w:val="TableBody"/>
+            </w:pPr>
+            <w:r>
+              <w:t xml:space="preserve">Adaptive vehicle destination, dashboard, keyset history, details and validated add/edit/confirmed delete using V2 components and existing leased repositories. Exact price preview, guarded actions and component tests; schema stays v10, native testing outstanding.</w:t>
+            </w:r>
+          </w:p>
+        </w:tc>
+      </w:tr>
+      <w:tr>
+        <w:tc>
+          <w:tcPr>
+            <w:tcW w:w="1100" w:type="dxa"/>
+          </w:tcPr>
+          <w:p>
+            <w:pPr>
+              <w:pStyle w:val="TableBody"/>
+            </w:pPr>
+            <w:r>
+              <w:t xml:space="preserve">2026-09-29</w:t>
+            </w:r>
+          </w:p>
+        </w:tc>
+        <w:tc>
+          <w:tcPr>
+            <w:tcW w:w="1850" w:type="dxa"/>
+          </w:tcPr>
+          <w:p>
+            <w:pPr>
+              <w:pStyle w:val="TableBody"/>
+            </w:pPr>
+            <w:r>
+              <w:t xml:space="preserve">Implemented Fuel / Charging V1 Stage 1 foundation.</w:t>
+            </w:r>
+          </w:p>
+        </w:tc>
+        <w:tc>
+          <w:tcPr>
+            <w:tcW w:w="6410" w:type="dxa"/>
+          </w:tcPr>
+          <w:p>
+            <w:pPr>
+              <w:pStyle w:val="TableBody"/>
+            </w:pPr>
+            <w:r>
+              <w:t xml:space="preserve">Additive schema v10, vehicle-scoped leased CRUD, exact money/units, keyset history, summaries and conservative full-to-full efficiency. Real SQLite tests cover preservation and v9/v10 backup restore; UI remains planned.</w:t>
             </w:r>
           </w:p>
         </w:tc>

</xml_diff>

<commit_message>
feat: add personal monthly budgets
</commit_message>
<xml_diff>
--- a/docs/LifePilot_Project_Guide.docx
+++ b/docs/LifePilot_Project_Guide.docx
@@ -1566,7 +1566,52 @@
         <w:t xml:space="preserve">src/components/personal/*</w:t>
       </w:r>
       <w:r>
-        <w:t xml:space="preserve">. Vehicle expenses remain separate unless a future deliberate architecture change is made. Custom category editing, budgets, recurring entries, and receipts are not implemented.</w:t>
+        <w:t xml:space="preserve">. Vehicle expenses remain separate unless a future deliberate architecture change is made. Personal Budgets V1 Stage 1 is implemented in </w:t>
+      </w:r>
+      <w:r>
+        <w:rPr>
+          <w:rStyle w:val="Code"/>
+        </w:rPr>
+        <w:t xml:space="preserve">src/database/personal-budgets.ts</w:t>
+      </w:r>
+      <w:r>
+        <w:t xml:space="preserve"> and </w:t>
+      </w:r>
+      <w:r>
+        <w:rPr>
+          <w:rStyle w:val="Code"/>
+        </w:rPr>
+        <w:t xml:space="preserve">src/features/personal/budget.ts</w:t>
+      </w:r>
+      <w:r>
+        <w:t xml:space="preserve">: monthly overall/category limits, leased mutations and dynamically derived exact spending/status. Stage 2 Budget UI is implemented under </w:t>
+      </w:r>
+      <w:r>
+        <w:rPr>
+          <w:rStyle w:val="Code"/>
+        </w:rPr>
+        <w:t xml:space="preserve">/personal/budget</w:t>
+      </w:r>
+      <w:r>
+        <w:t xml:space="preserve"> and </w:t>
+      </w:r>
+      <w:r>
+        <w:rPr>
+          <w:rStyle w:val="Code"/>
+        </w:rPr>
+        <w:t xml:space="preserve">/personal/budget-edit</w:t>
+      </w:r>
+      <w:r>
+        <w:t xml:space="preserve">, reached from the selected month on Personal Expenses. It provides overall/category set/edit/confirmed removal, exact status/progress presentation and focus-refreshed transaction-derived spending. Custom category editing, recurring entries and receipts are not implemented. See </w:t>
+      </w:r>
+      <w:r>
+        <w:rPr>
+          <w:rStyle w:val="Code"/>
+        </w:rPr>
+        <w:t xml:space="preserve">docs/PERSONAL_BUDGETS.md</w:t>
+      </w:r>
+      <w:r>
+        <w:t xml:space="preserve">.</w:t>
       </w:r>
     </w:p>
     <w:p>
@@ -1701,19 +1746,10 @@
         <w:rPr>
           <w:b/>
         </w:rPr>
-        <w:t xml:space="preserve">10</w:t>
-      </w:r>
-      <w:r>
-        <w:t xml:space="preserve">. There is no separate migration folder. Version 10 adds </w:t>
-      </w:r>
-      <w:r>
-        <w:rPr>
-          <w:rStyle w:val="Code"/>
-        </w:rPr>
-        <w:t xml:space="preserve">vehicle_fuel_entries</w:t>
-      </w:r>
-      <w:r>
-        <w:t xml:space="preserve"> and its vehicle/date/id history index without changing existing tables or rows. The UI/UX V2 work added no migration and made no database schema change.</w:t>
+        <w:t xml:space="preserve">11</w:t>
+      </w:r>
+      <w:r>
+        <w:t xml:space="preserve">. There is no separate migration folder. Version 11 adds monthly overall/category budget configuration with restrictive expense-category FKs; version 10 added vehicle fuel entries. Existing rows are preserved. The UI/UX V2 work added no migration and made no database schema change.</w:t>
       </w:r>
     </w:p>
     <w:tbl>
@@ -2254,6 +2290,47 @@
           </w:p>
         </w:tc>
       </w:tr>
+      <w:tr>
+        <w:tc>
+          <w:tcPr>
+            <w:tcW w:w="1100" w:type="dxa"/>
+          </w:tcPr>
+          <w:p>
+            <w:pPr>
+              <w:pStyle w:val="TableBody"/>
+            </w:pPr>
+            <w:r>
+              <w:t xml:space="preserve">11</w:t>
+            </w:r>
+          </w:p>
+        </w:tc>
+        <w:tc>
+          <w:tcPr>
+            <w:tcW w:w="1850" w:type="dxa"/>
+          </w:tcPr>
+          <w:p>
+            <w:pPr>
+              <w:pStyle w:val="TableBody"/>
+            </w:pPr>
+            <w:r>
+              <w:t xml:space="preserve">Personal Budgets foundation</w:t>
+            </w:r>
+          </w:p>
+        </w:tc>
+        <w:tc>
+          <w:tcPr>
+            <w:tcW w:w="6410" w:type="dxa"/>
+          </w:tcPr>
+          <w:p>
+            <w:pPr>
+              <w:pStyle w:val="TableBody"/>
+            </w:pPr>
+            <w:r>
+              <w:t xml:space="preserve">Overall month and category/month limits in integer paise; unique keys and restrictive expense-category FK; no persisted spending.</w:t>
+            </w:r>
+          </w:p>
+        </w:tc>
+      </w:tr>
     </w:tbl>
     <w:p>
       <w:pPr>
@@ -2688,7 +2765,7 @@
         <w:t xml:space="preserve">vehicle-photos</w:t>
       </w:r>
       <w:r>
-        <w:t xml:space="preserve"> root, a versioned manifest and SHA-256 plus byte size for every entry. This covers fuel/charging records and vehicle records/photos, service history/bills, insurance/PUC records and images, Personal Expenses, Tasks, categories and SQLite reminder preferences. Cache, staging, generated backups, credentials, build files, native notification inventory/permissions/channels and the separate device-local appearance preference database are excluded.</w:t>
+        <w:t xml:space="preserve"> root, a versioned manifest and SHA-256 plus byte size for every entry. This covers personal budget configuration, fuel/charging records and vehicle records/photos, service history/bills, insurance/PUC records and images, Personal Expenses, Tasks, categories and SQLite reminder preferences. Cache, staging, generated backups, credentials, build files, native notification inventory/permissions/channels and the separate device-local appearance preference database are excluded.</w:t>
       </w:r>
     </w:p>
     <w:p>
@@ -2696,7 +2773,7 @@
         <w:pStyle w:val="Normal"/>
       </w:pPr>
       <w:r>
-        <w:t xml:space="preserve">Restore inspection verifies structure, paths, counts, Base64 sizes, checksums, SQLite integrity and actual schema without changing active data. Schema v10 restores directly; v9 upgrades add the empty fuel table; older supported schemas use the existing migration function in isolation; newer schemas are rejected. Before replacement, the engine snapshots the current database and owned file tree. It writes through Expo SQLite's online backup API and replacement-restores only the owned file root, with database/file rollback on failure. The root coordinator synchronously closes mutation admission, unmounts navigation/providers and awaits the central activity drain before authorizing replacement. Recoverable failures release ownership; successful restore keeps the restart-required lock. Catastrophic rollback failure retains exclusive ownership and a recovery screen that blocks Android Back and instructs the user to stop using LifePilot and close it without claiming that reopening repairs data.</w:t>
+        <w:t xml:space="preserve">Restore inspection verifies structure, paths, counts, Base64 sizes, checksums, SQLite integrity and actual schema without changing active data. Schema v11 restores directly; v10 upgrades add empty budget tables; v9 also adds the fuel table; older supported schemas use the existing migration function in isolation; newer schemas are rejected. Before replacement, the engine snapshots the current database and owned file tree. It writes through Expo SQLite's online backup API and replacement-restores only the owned file root, with database/file rollback on failure. The root coordinator synchronously closes mutation admission, unmounts navigation/providers and awaits the central activity drain before authorizing replacement. Recoverable failures release ownership; successful restore keeps the restart-required lock. Catastrophic rollback failure retains exclusive ownership and a recovery screen that blocks Android Back and instructs the user to stop using LifePilot and close it without claiming that reopening repairs data.</w:t>
       </w:r>
     </w:p>
     <w:p>
@@ -3620,6 +3697,63 @@
               <w:pStyle w:val="TableBody"/>
             </w:pPr>
             <w:r>
+              <w:t xml:space="preserve">Needs device verification</w:t>
+            </w:r>
+          </w:p>
+        </w:tc>
+        <w:tc>
+          <w:tcPr>
+            <w:tcW w:w="1900" w:type="dxa"/>
+            <w:shd w:fill="F7FAF8"/>
+          </w:tcPr>
+          <w:p>
+            <w:pPr>
+              <w:pStyle w:val="TableBody"/>
+            </w:pPr>
+            <w:r>
+              <w:t xml:space="preserve">Personal Budgets</w:t>
+            </w:r>
+          </w:p>
+        </w:tc>
+        <w:tc>
+          <w:tcPr>
+            <w:tcW w:w="3500" w:type="dxa"/>
+            <w:shd w:fill="F7FAF8"/>
+          </w:tcPr>
+          <w:p>
+            <w:pPr>
+              <w:pStyle w:val="TableBody"/>
+            </w:pPr>
+            <w:r>
+              <w:t xml:space="preserve">Stages 1 and 2 provide monthly overall/category limits, budget UI and exact transaction-derived progress with automated SQLite/component tests.</w:t>
+            </w:r>
+          </w:p>
+        </w:tc>
+        <w:tc>
+          <w:tcPr>
+            <w:tcW w:w="2360" w:type="dxa"/>
+            <w:shd w:fill="F7FAF8"/>
+          </w:tcPr>
+          <w:p>
+            <w:pPr>
+              <w:pStyle w:val="TableBody"/>
+            </w:pPr>
+            <w:r>
+              <w:t xml:space="preserve">Verify native forms/removal, themes, accessibility, keyboard/Back, month/focus refresh, v10 upgrade, persistence and restore.</w:t>
+            </w:r>
+          </w:p>
+        </w:tc>
+      </w:tr>
+      <w:tr>
+        <w:tc>
+          <w:tcPr>
+            <w:tcW w:w="1600" w:type="dxa"/>
+          </w:tcPr>
+          <w:p>
+            <w:pPr>
+              <w:pStyle w:val="TableBody"/>
+            </w:pPr>
+            <w:r>
               <w:t xml:space="preserve">Open documentation debt</w:t>
             </w:r>
           </w:p>
@@ -3627,7 +3761,6 @@
         <w:tc>
           <w:tcPr>
             <w:tcW w:w="1900" w:type="dxa"/>
-            <w:shd w:fill="F7FAF8"/>
           </w:tcPr>
           <w:p>
             <w:pPr>
@@ -3641,7 +3774,6 @@
         <w:tc>
           <w:tcPr>
             <w:tcW w:w="3500" w:type="dxa"/>
-            <w:shd w:fill="F7FAF8"/>
           </w:tcPr>
           <w:p>
             <w:pPr>
@@ -3655,7 +3787,6 @@
         <w:tc>
           <w:tcPr>
             <w:tcW w:w="2360" w:type="dxa"/>
-            <w:shd w:fill="F7FAF8"/>
           </w:tcPr>
           <w:p>
             <w:pPr>
@@ -3691,7 +3822,7 @@
         <w:pStyle w:val="Normal"/>
       </w:pPr>
       <w:r>
-        <w:t xml:space="preserve">Fuel / Charging Stages 1 and 2 are implemented; reports remain planned. Other planned or future candidates are general vehicle document uploads; personal budgets, recurring entries, receipts and custom category editing; and task recurring items, subtasks, custom categories and attachments. These are </w:t>
+        <w:t xml:space="preserve">Fuel / Charging Stages 1 and 2 are implemented; reports remain planned. Other planned or future candidates are general vehicle document uploads; personal recurring entries, receipts and custom category editing; and task recurring items, subtasks, custom categories and attachments. These are </w:t>
       </w:r>
       <w:r>
         <w:rPr>
@@ -3966,7 +4097,7 @@
               <w:rPr>
                 <w:rStyle w:val="Code"/>
               </w:rPr>
-              <w:t xml:space="preserve">src/database/{personal,personal-analytics,tasks}.ts</w:t>
+              <w:t xml:space="preserve">src/database/{personal,personal-analytics,personal-budgets,tasks}.ts</w:t>
             </w:r>
           </w:p>
         </w:tc>
@@ -4153,6 +4284,38 @@
               <w:rPr>
                 <w:rStyle w:val="Code"/>
               </w:rPr>
+              <w:t xml:space="preserve">docs/PERSONAL_BUDGETS.md</w:t>
+            </w:r>
+          </w:p>
+        </w:tc>
+        <w:tc>
+          <w:tcPr>
+            <w:tcW w:w="5760" w:type="dxa"/>
+          </w:tcPr>
+          <w:p>
+            <w:pPr>
+              <w:pStyle w:val="TableBody"/>
+            </w:pPr>
+            <w:r>
+              <w:t xml:space="preserve">Budget schema/APIs, Stage 2 UI, exact progress/status, category restrictions and manual checks.</w:t>
+            </w:r>
+          </w:p>
+        </w:tc>
+      </w:tr>
+      <w:tr>
+        <w:tc>
+          <w:tcPr>
+            <w:tcW w:w="3600" w:type="dxa"/>
+            <w:shd w:fill="F7FAF8"/>
+          </w:tcPr>
+          <w:p>
+            <w:pPr>
+              <w:pStyle w:val="TableBody"/>
+            </w:pPr>
+            <w:r>
+              <w:rPr>
+                <w:rStyle w:val="Code"/>
+              </w:rPr>
               <w:t xml:space="preserve">docs/FUEL_CHARGING.md</w:t>
             </w:r>
           </w:p>
@@ -4160,6 +4323,7 @@
         <w:tc>
           <w:tcPr>
             <w:tcW w:w="5760" w:type="dxa"/>
+            <w:shd w:fill="F7FAF8"/>
           </w:tcPr>
           <w:p>
             <w:pPr>
@@ -4175,7 +4339,6 @@
         <w:tc>
           <w:tcPr>
             <w:tcW w:w="3600" w:type="dxa"/>
-            <w:shd w:fill="F7FAF8"/>
           </w:tcPr>
           <w:p>
             <w:pPr>
@@ -4192,7 +4355,6 @@
         <w:tc>
           <w:tcPr>
             <w:tcW w:w="5760" w:type="dxa"/>
-            <w:shd w:fill="F7FAF8"/>
           </w:tcPr>
           <w:p>
             <w:pPr>
@@ -4208,6 +4370,7 @@
         <w:tc>
           <w:tcPr>
             <w:tcW w:w="3600" w:type="dxa"/>
+            <w:shd w:fill="F7FAF8"/>
           </w:tcPr>
           <w:p>
             <w:pPr>
@@ -4233,6 +4396,7 @@
         <w:tc>
           <w:tcPr>
             <w:tcW w:w="5760" w:type="dxa"/>
+            <w:shd w:fill="F7FAF8"/>
           </w:tcPr>
           <w:p>
             <w:pPr>
@@ -4248,7 +4412,6 @@
         <w:tc>
           <w:tcPr>
             <w:tcW w:w="3600" w:type="dxa"/>
-            <w:shd w:fill="F7FAF8"/>
           </w:tcPr>
           <w:p>
             <w:pPr>
@@ -4274,7 +4437,6 @@
         <w:tc>
           <w:tcPr>
             <w:tcW w:w="5760" w:type="dxa"/>
-            <w:shd w:fill="F7FAF8"/>
           </w:tcPr>
           <w:p>
             <w:pPr>
@@ -4290,6 +4452,7 @@
         <w:tc>
           <w:tcPr>
             <w:tcW w:w="3600" w:type="dxa"/>
+            <w:shd w:fill="F7FAF8"/>
           </w:tcPr>
           <w:p>
             <w:pPr>
@@ -4324,6 +4487,7 @@
         <w:tc>
           <w:tcPr>
             <w:tcW w:w="5760" w:type="dxa"/>
+            <w:shd w:fill="F7FAF8"/>
           </w:tcPr>
           <w:p>
             <w:pPr>
@@ -4886,7 +5050,7 @@
         <w:t xml:space="preserve">Completed in source:</w:t>
       </w:r>
       <w:r>
-        <w:t xml:space="preserve"> UI/UX V2 across Home, Tasks, Garage/Vehicle Detail, Personal Expenses, Vehicle Reminders/Settings, Settings/About and remaining vehicle forms; vehicle CRUD/photos/services/coverage; personal transactions and analytics; tasks; appearance themes; local reminder scheduling; Expo Go notification isolation; Backup &amp; Restore V1 create/inspect/replacement/rollback UI and engines, shared mutation leases/exclusive maintenance and persistent catastrophic recovery material; Fuel / Charging Stage 1 foundation and Stage 2 dashboard/forms/history/details; migrations through v10; and regression scripts.</w:t>
+        <w:t xml:space="preserve"> UI/UX V2 across Home, Tasks, Garage/Vehicle Detail, Personal Expenses, Vehicle Reminders/Settings, Settings/About and remaining vehicle forms; vehicle CRUD/photos/services/coverage; personal transactions and analytics; tasks; appearance themes; local reminder scheduling; Expo Go notification isolation; Backup &amp; Restore V1 create/inspect/replacement/rollback UI and engines, shared mutation leases/exclusive maintenance and persistent catastrophic recovery material; Fuel / Charging Stage 1 foundation and Stage 2 dashboard/forms/history/details; Personal Budgets Stages 1 and 2 foundation/dashboard/forms; migrations through v11; and regression scripts.</w:t>
       </w:r>
     </w:p>
     <w:p>
@@ -4940,7 +5104,7 @@
         <w:t xml:space="preserve">Next:</w:t>
       </w:r>
       <w:r>
-        <w:t xml:space="preserve"> complete real-device Backup &amp; Restore safety tests (including in-flight operations, rollback failure and process interruption) and final V2 regression testing. Fuel/charging device validation and future reports, general document uploads and cloud account/sync remain future work.</w:t>
+        <w:t xml:space="preserve"> complete real-device Backup &amp; Restore safety tests (including in-flight operations, rollback failure and process interruption) and final V2 regression testing. Personal Budget device validation, fuel/charging device validation and future reports, general document uploads and cloud account/sync remain future work.</w:t>
       </w:r>
     </w:p>
     <w:p>
@@ -5322,6 +5486,91 @@
             </w:pPr>
             <w:r>
               <w:t xml:space="preserve">Adds checksummed portable packages, safe inspection, isolated migration, coordinated replacement/rollback, cross-device path rebasing and restart locking without a schema or dependency change.</w:t>
+            </w:r>
+          </w:p>
+        </w:tc>
+      </w:tr>
+      <w:tr>
+        <w:tc>
+          <w:tcPr>
+            <w:tcW w:w="1100" w:type="dxa"/>
+            <w:shd w:fill="F7FAF8"/>
+          </w:tcPr>
+          <w:p>
+            <w:pPr>
+              <w:pStyle w:val="TableBody"/>
+            </w:pPr>
+            <w:r>
+              <w:t xml:space="preserve">2026-09-29</w:t>
+            </w:r>
+          </w:p>
+        </w:tc>
+        <w:tc>
+          <w:tcPr>
+            <w:tcW w:w="1850" w:type="dxa"/>
+            <w:shd w:fill="F7FAF8"/>
+          </w:tcPr>
+          <w:p>
+            <w:pPr>
+              <w:pStyle w:val="TableBody"/>
+            </w:pPr>
+            <w:r>
+              <w:t xml:space="preserve">Implemented Personal Budgets V1 Stage 2 UI.</w:t>
+            </w:r>
+          </w:p>
+        </w:tc>
+        <w:tc>
+          <w:tcPr>
+            <w:tcW w:w="6410" w:type="dxa"/>
+            <w:shd w:fill="F7FAF8"/>
+          </w:tcPr>
+          <w:p>
+            <w:pPr>
+              <w:pStyle w:val="TableBody"/>
+            </w:pPr>
+            <w:r>
+              <w:t xml:space="preserve">Personal Expense entry point, selected-month dashboard, overall/category editor/removal, accessible exact-derived progress and focus refresh. Twelve real-SQLite/component test groups; schema remains v11 and native checks remain outstanding.</w:t>
+            </w:r>
+          </w:p>
+        </w:tc>
+      </w:tr>
+      <w:tr>
+        <w:tc>
+          <w:tcPr>
+            <w:tcW w:w="1100" w:type="dxa"/>
+          </w:tcPr>
+          <w:p>
+            <w:pPr>
+              <w:pStyle w:val="TableBody"/>
+            </w:pPr>
+            <w:r>
+              <w:t xml:space="preserve">2026-09-29</w:t>
+            </w:r>
+          </w:p>
+        </w:tc>
+        <w:tc>
+          <w:tcPr>
+            <w:tcW w:w="1850" w:type="dxa"/>
+          </w:tcPr>
+          <w:p>
+            <w:pPr>
+              <w:pStyle w:val="TableBody"/>
+            </w:pPr>
+            <w:r>
+              <w:t xml:space="preserve">Implemented Personal Budgets V1 Stage 1 foundation.</w:t>
+            </w:r>
+          </w:p>
+        </w:tc>
+        <w:tc>
+          <w:tcPr>
+            <w:tcW w:w="6410" w:type="dxa"/>
+          </w:tcPr>
+          <w:p>
+            <w:pPr>
+              <w:pStyle w:val="TableBody"/>
+            </w:pPr>
+            <w:r>
+              <w:t xml:space="preserve">Additive v11 overall/category limits, expense-only live summaries, exact thresholds, lifecycle coordination and real SQLite migration/restore tests. No Budget UI or vehicle accounting changes.</w:t>
             </w:r>
           </w:p>
         </w:tc>

</xml_diff>

<commit_message>
fix: harden backup snapshot consistency
</commit_message>
<xml_diff>
--- a/docs/LifePilot_Project_Guide.docx
+++ b/docs/LifePilot_Project_Guide.docx
@@ -203,6 +203,16 @@
       </w:pPr>
       <w:hyperlink w:anchor="section_15" w:history="1">
         <w:r>
+          <w:t xml:space="preserve">Backup consistency and operation ownership</w:t>
+        </w:r>
+      </w:hyperlink>
+    </w:p>
+    <w:p>
+      <w:pPr>
+        <w:pStyle w:val="Toc"/>
+      </w:pPr>
+      <w:hyperlink w:anchor="section_16" w:history="1">
+        <w:r>
           <w:t xml:space="preserve">Operation ownership and recovery persistence</w:t>
         </w:r>
       </w:hyperlink>
@@ -211,7 +221,7 @@
       <w:pPr>
         <w:pStyle w:val="Toc"/>
       </w:pPr>
-      <w:hyperlink w:anchor="section_16" w:history="1">
+      <w:hyperlink w:anchor="section_17" w:history="1">
         <w:r>
           <w:t xml:space="preserve">13. Testing</w:t>
         </w:r>
@@ -221,7 +231,7 @@
       <w:pPr>
         <w:pStyle w:val="Toc"/>
       </w:pPr>
-      <w:hyperlink w:anchor="section_17" w:history="1">
+      <w:hyperlink w:anchor="section_18" w:history="1">
         <w:r>
           <w:t xml:space="preserve">14. Development Environment</w:t>
         </w:r>
@@ -231,7 +241,7 @@
       <w:pPr>
         <w:pStyle w:val="Toc"/>
       </w:pPr>
-      <w:hyperlink w:anchor="section_18" w:history="1">
+      <w:hyperlink w:anchor="section_19" w:history="1">
         <w:r>
           <w:t xml:space="preserve">15. Git Workflow</w:t>
         </w:r>
@@ -241,7 +251,7 @@
       <w:pPr>
         <w:pStyle w:val="Toc"/>
       </w:pPr>
-      <w:hyperlink w:anchor="section_19" w:history="1">
+      <w:hyperlink w:anchor="section_20" w:history="1">
         <w:r>
           <w:t xml:space="preserve">16. Android / EAS Build System</w:t>
         </w:r>
@@ -251,7 +261,7 @@
       <w:pPr>
         <w:pStyle w:val="Toc"/>
       </w:pPr>
-      <w:hyperlink w:anchor="section_20" w:history="1">
+      <w:hyperlink w:anchor="section_21" w:history="1">
         <w:r>
           <w:t xml:space="preserve">17. APK Update Safety</w:t>
         </w:r>
@@ -261,7 +271,7 @@
       <w:pPr>
         <w:pStyle w:val="Toc"/>
       </w:pPr>
-      <w:hyperlink w:anchor="section_21" w:history="1">
+      <w:hyperlink w:anchor="section_22" w:history="1">
         <w:r>
           <w:t xml:space="preserve">18. Known Issues</w:t>
         </w:r>
@@ -271,7 +281,7 @@
       <w:pPr>
         <w:pStyle w:val="Toc"/>
       </w:pPr>
-      <w:hyperlink w:anchor="section_22" w:history="1">
+      <w:hyperlink w:anchor="section_23" w:history="1">
         <w:r>
           <w:t xml:space="preserve">19. Future Roadmap</w:t>
         </w:r>
@@ -281,7 +291,7 @@
       <w:pPr>
         <w:pStyle w:val="Toc"/>
       </w:pPr>
-      <w:hyperlink w:anchor="section_23" w:history="1">
+      <w:hyperlink w:anchor="section_24" w:history="1">
         <w:r>
           <w:t xml:space="preserve">20. Important Files</w:t>
         </w:r>
@@ -291,7 +301,7 @@
       <w:pPr>
         <w:pStyle w:val="Toc"/>
       </w:pPr>
-      <w:hyperlink w:anchor="section_24" w:history="1">
+      <w:hyperlink w:anchor="section_25" w:history="1">
         <w:r>
           <w:t xml:space="preserve">21. Important Technical Decisions</w:t>
         </w:r>
@@ -301,7 +311,7 @@
       <w:pPr>
         <w:pStyle w:val="Toc"/>
       </w:pPr>
-      <w:hyperlink w:anchor="section_25" w:history="1">
+      <w:hyperlink w:anchor="section_26" w:history="1">
         <w:r>
           <w:t xml:space="preserve">22. Instructions for Future LLMs</w:t>
         </w:r>
@@ -311,7 +321,7 @@
       <w:pPr>
         <w:pStyle w:val="Toc"/>
       </w:pPr>
-      <w:hyperlink w:anchor="section_26" w:history="1">
+      <w:hyperlink w:anchor="section_27" w:history="1">
         <w:r>
           <w:t xml:space="preserve">23. Current Project State</w:t>
         </w:r>
@@ -321,7 +331,7 @@
       <w:pPr>
         <w:pStyle w:val="Toc"/>
       </w:pPr>
-      <w:hyperlink w:anchor="section_27" w:history="1">
+      <w:hyperlink w:anchor="section_28" w:history="1">
         <w:r>
           <w:t xml:space="preserve">24. Changelog</w:t>
         </w:r>
@@ -336,11 +346,11 @@
       <w:pPr>
         <w:pStyle w:val="Heading1"/>
       </w:pPr>
-      <w:bookmarkStart w:id="35" w:name="section_1"/>
+      <w:bookmarkStart w:id="36" w:name="section_1"/>
       <w:r>
         <w:t xml:space="preserve">LifePilot – Master Project Context</w:t>
       </w:r>
-      <w:bookmarkEnd w:id="35"/>
+      <w:bookmarkEnd w:id="36"/>
     </w:p>
     <w:p>
       <w:pPr>
@@ -354,11 +364,11 @@
       <w:pPr>
         <w:pStyle w:val="Heading2"/>
       </w:pPr>
-      <w:bookmarkStart w:id="37" w:name="section_2"/>
+      <w:bookmarkStart w:id="38" w:name="section_2"/>
       <w:r>
         <w:t xml:space="preserve">1. Project Overview</w:t>
       </w:r>
-      <w:bookmarkEnd w:id="37"/>
+      <w:bookmarkEnd w:id="38"/>
     </w:p>
     <w:p>
       <w:pPr>
@@ -381,11 +391,11 @@
       <w:pPr>
         <w:pStyle w:val="Heading2"/>
       </w:pPr>
-      <w:bookmarkStart w:id="39" w:name="section_3"/>
+      <w:bookmarkStart w:id="40" w:name="section_3"/>
       <w:r>
         <w:t xml:space="preserve">2. Product Principles</w:t>
       </w:r>
-      <w:bookmarkEnd w:id="39"/>
+      <w:bookmarkEnd w:id="40"/>
     </w:p>
     <w:p>
       <w:pPr>
@@ -439,11 +449,11 @@
       <w:pPr>
         <w:pStyle w:val="Heading2"/>
       </w:pPr>
-      <w:bookmarkStart w:id="44" w:name="section_4"/>
+      <w:bookmarkStart w:id="45" w:name="section_4"/>
       <w:r>
         <w:t xml:space="preserve">3. Technology Stack</w:t>
       </w:r>
-      <w:bookmarkEnd w:id="44"/>
+      <w:bookmarkEnd w:id="45"/>
     </w:p>
     <w:p>
       <w:pPr>
@@ -909,11 +919,11 @@
       <w:pPr>
         <w:pStyle w:val="Heading2"/>
       </w:pPr>
-      <w:bookmarkStart w:id="48" w:name="section_5"/>
+      <w:bookmarkStart w:id="49" w:name="section_5"/>
       <w:r>
         <w:t xml:space="preserve">4. Architecture</w:t>
       </w:r>
-      <w:bookmarkEnd w:id="48"/>
+      <w:bookmarkEnd w:id="49"/>
     </w:p>
     <w:p>
       <w:pPr>
@@ -1069,11 +1079,11 @@
       <w:pPr>
         <w:pStyle w:val="Heading2"/>
       </w:pPr>
-      <w:bookmarkStart w:id="60" w:name="section_6"/>
+      <w:bookmarkStart w:id="61" w:name="section_6"/>
       <w:r>
         <w:t xml:space="preserve">5. Navigation</w:t>
       </w:r>
-      <w:bookmarkEnd w:id="60"/>
+      <w:bookmarkEnd w:id="61"/>
     </w:p>
     <w:p>
       <w:pPr>
@@ -1228,11 +1238,11 @@
       <w:pPr>
         <w:pStyle w:val="Heading2"/>
       </w:pPr>
-      <w:bookmarkStart w:id="62" w:name="section_7"/>
+      <w:bookmarkStart w:id="63" w:name="section_7"/>
       <w:r>
         <w:t xml:space="preserve">6. UI / Theme / Branding</w:t>
       </w:r>
-      <w:bookmarkEnd w:id="62"/>
+      <w:bookmarkEnd w:id="63"/>
     </w:p>
     <w:p>
       <w:pPr>
@@ -1361,11 +1371,11 @@
       <w:pPr>
         <w:pStyle w:val="Heading2"/>
       </w:pPr>
-      <w:bookmarkStart w:id="66" w:name="section_8"/>
+      <w:bookmarkStart w:id="67" w:name="section_8"/>
       <w:r>
         <w:t xml:space="preserve">7. Vehicle Manager</w:t>
       </w:r>
-      <w:bookmarkEnd w:id="66"/>
+      <w:bookmarkEnd w:id="67"/>
     </w:p>
     <w:p>
       <w:pPr>
@@ -1486,11 +1496,11 @@
       <w:pPr>
         <w:pStyle w:val="Heading2"/>
       </w:pPr>
-      <w:bookmarkStart w:id="69" w:name="section_9"/>
+      <w:bookmarkStart w:id="70" w:name="section_9"/>
       <w:r>
         <w:t xml:space="preserve">8. Personal Expense Manager</w:t>
       </w:r>
-      <w:bookmarkEnd w:id="69"/>
+      <w:bookmarkEnd w:id="70"/>
     </w:p>
     <w:p>
       <w:pPr>
@@ -1618,11 +1628,11 @@
       <w:pPr>
         <w:pStyle w:val="Heading2"/>
       </w:pPr>
-      <w:bookmarkStart w:id="71" w:name="section_10"/>
+      <w:bookmarkStart w:id="72" w:name="section_10"/>
       <w:r>
         <w:t xml:space="preserve">9. Tasks / To-Do</w:t>
       </w:r>
-      <w:bookmarkEnd w:id="71"/>
+      <w:bookmarkEnd w:id="72"/>
     </w:p>
     <w:p>
       <w:pPr>
@@ -1714,11 +1724,11 @@
       <w:pPr>
         <w:pStyle w:val="Heading2"/>
       </w:pPr>
-      <w:bookmarkStart w:id="73" w:name="section_11"/>
+      <w:bookmarkStart w:id="74" w:name="section_11"/>
       <w:r>
         <w:t xml:space="preserve">10. Database Architecture</w:t>
       </w:r>
-      <w:bookmarkEnd w:id="73"/>
+      <w:bookmarkEnd w:id="74"/>
     </w:p>
     <w:p>
       <w:pPr>
@@ -2531,11 +2541,11 @@
       <w:pPr>
         <w:pStyle w:val="Heading2"/>
       </w:pPr>
-      <w:bookmarkStart w:id="79" w:name="section_12"/>
+      <w:bookmarkStart w:id="80" w:name="section_12"/>
       <w:r>
         <w:t xml:space="preserve">11. File Storage</w:t>
       </w:r>
-      <w:bookmarkEnd w:id="79"/>
+      <w:bookmarkEnd w:id="80"/>
     </w:p>
     <w:p>
       <w:pPr>
@@ -2603,11 +2613,11 @@
       <w:pPr>
         <w:pStyle w:val="Heading2"/>
       </w:pPr>
-      <w:bookmarkStart w:id="81" w:name="section_13"/>
+      <w:bookmarkStart w:id="82" w:name="section_13"/>
       <w:r>
         <w:t xml:space="preserve">12. Notifications</w:t>
       </w:r>
-      <w:bookmarkEnd w:id="81"/>
+      <w:bookmarkEnd w:id="82"/>
     </w:p>
     <w:p>
       <w:pPr>
@@ -2718,11 +2728,11 @@
       <w:pPr>
         <w:pStyle w:val="Heading2"/>
       </w:pPr>
-      <w:bookmarkStart w:id="85" w:name="section_14"/>
+      <w:bookmarkStart w:id="86" w:name="section_14"/>
       <w:r>
         <w:t xml:space="preserve">12A. Backup &amp; Restore V1</w:t>
       </w:r>
-      <w:bookmarkEnd w:id="85"/>
+      <w:bookmarkEnd w:id="86"/>
     </w:p>
     <w:p>
       <w:pPr>
@@ -2797,11 +2807,82 @@
       <w:pPr>
         <w:pStyle w:val="Heading3"/>
       </w:pPr>
-      <w:bookmarkStart w:id="89" w:name="section_15"/>
+      <w:bookmarkStart w:id="90" w:name="section_15"/>
+      <w:r>
+        <w:t xml:space="preserve">Backup consistency and operation ownership</w:t>
+      </w:r>
+      <w:bookmarkEnd w:id="90"/>
+    </w:p>
+    <w:p>
+      <w:pPr>
+        <w:pStyle w:val="Normal"/>
+      </w:pPr>
+      <w:r>
+        <w:t xml:space="preserve">Backup creation now uses a separate central snapshot barrier: </w:t>
+      </w:r>
+      <w:r>
+        <w:rPr>
+          <w:rStyle w:val="Code"/>
+        </w:rPr>
+        <w:t xml:space="preserve">normal -&gt; snapshot-draining -&gt; snapshot -&gt; normal</w:t>
+      </w:r>
+      <w:r>
+        <w:t xml:space="preserve">. It closes mutation admission synchronously, drains admitted operations and nested cleanup, then captures SQLite/schema and every owned media file into attempt-private bytes. Admission resumes before encoding, hashing, verification, package output, cleanup or provider export. No restore authorization, provider unmount or restart lock is used. A service-level guard rejects concurrent creates with typed </w:t>
+      </w:r>
+      <w:r>
+        <w:rPr>
+          <w:rStyle w:val="Code"/>
+        </w:rPr>
+        <w:t xml:space="preserve">busy</w:t>
+      </w:r>
+      <w:r>
+        <w:t xml:space="preserve">; the UI has an immediate ref guard. Nested backup calls with an OperationContext are rejected; callers must never await capture while holding a normal lease.</w:t>
+      </w:r>
+    </w:p>
+    <w:p>
+      <w:pPr>
+        <w:pStyle w:val="Normal"/>
+      </w:pPr>
+      <w:r>
+        <w:t xml:space="preserve">Each attempt owns a validated </w:t>
+      </w:r>
+      <w:r>
+        <w:rPr>
+          <w:rStyle w:val="Code"/>
+        </w:rPr>
+        <w:t xml:space="preserve">Paths.cache/lifepilot-backup-&lt;UUID&gt;/</w:t>
+      </w:r>
+      <w:r>
+        <w:t xml:space="preserve"> directory. Collisions preserve existing content, cleanup touches only the attempt, and recovery directories remain separate. Output must be a direct private </w:t>
+      </w:r>
+      <w:r>
+        <w:rPr>
+          <w:rStyle w:val="Code"/>
+        </w:rPr>
+        <w:t xml:space="preserve">.lpbackup</w:t>
+      </w:r>
+      <w:r>
+        <w:t xml:space="preserve"> file and is reserved without overwrite. Capture failures resume admission; cleanup failures report </w:t>
+      </w:r>
+      <w:r>
+        <w:rPr>
+          <w:rStyle w:val="Code"/>
+        </w:rPr>
+        <w:t xml:space="preserve">cleanupIncomplete</w:t>
+      </w:r>
+      <w:r>
+        <w:t xml:space="preserve"> on the result or primary BackupError without retaining lifecycle ownership. Current coverage remains the vehicle-photo tree, including service bills and Insurance/PUC images. Future attachment roots must join both archive coverage and leased mutation workflows. The guarantee covers participating in-process mutations, not pre-existing missing files or process death. Large in-memory capture/JSON packaging still needs device verification. Schema v11, format v1 and dependencies are unchanged.</w:t>
+      </w:r>
+    </w:p>
+    <w:p>
+      <w:pPr>
+        <w:pStyle w:val="Heading3"/>
+      </w:pPr>
+      <w:bookmarkStart w:id="93" w:name="section_16"/>
       <w:r>
         <w:t xml:space="preserve">Operation ownership and recovery persistence</w:t>
       </w:r>
-      <w:bookmarkEnd w:id="89"/>
+      <w:bookmarkEnd w:id="93"/>
     </w:p>
     <w:p>
       <w:pPr>
@@ -2823,7 +2904,7 @@
         <w:t xml:space="preserve">OperationContext</w:t>
       </w:r>
       <w:r>
-        <w:t xml:space="preserve"> values and identity-validated exclusive authorization. Whole vehicle workflows, repository mutations, private connection closure, filesystem/error cleanup, personal/task mutations, reminder writes and reconciliation, permission continuations, cleanup retries and backup creation are covered. Nested helpers share the admitted context and may finish during suspension. New operations are rejected synchronously; queued task reconciliation is invalidated by suspension. Reads and the separate appearance preference database remain outside the mutation barrier. Startup migration precedes application operations; staged restore migration runs under exclusive ownership. No schema change, dependency addition or backup-format change was required.</w:t>
+        <w:t xml:space="preserve"> values and identity-validated exclusive authorization. Whole vehicle workflows, repository mutations, private connection closure, filesystem/error cleanup, personal/task mutations, reminder writes and reconciliation, permission continuations and cleanup retries are covered by normal leases; backup source capture uses the separate barrier above. Nested helpers share the admitted context and may finish during suspension. New operations are rejected synchronously; queued task reconciliation is invalidated by suspension. Reads and the separate appearance preference database remain outside the mutation barrier. Startup migration precedes application operations; staged restore migration runs under exclusive ownership. No schema change, dependency addition or backup-format change was required.</w:t>
       </w:r>
     </w:p>
     <w:p>
@@ -2865,11 +2946,11 @@
       <w:pPr>
         <w:pStyle w:val="Heading2"/>
       </w:pPr>
-      <w:bookmarkStart w:id="92" w:name="section_16"/>
+      <w:bookmarkStart w:id="96" w:name="section_17"/>
       <w:r>
         <w:t xml:space="preserve">13. Testing</w:t>
       </w:r>
-      <w:bookmarkEnd w:id="92"/>
+      <w:bookmarkEnd w:id="96"/>
     </w:p>
     <w:p>
       <w:pPr>
@@ -2930,7 +3011,7 @@
         <w:t xml:space="preserve">tests/</w:t>
       </w:r>
       <w:r>
-        <w:t xml:space="preserve"> directory or Jest script. Operation lifecycle and restore-session regression scripts now exercise cross-domain races, queue invalidation, cleanup/private-connection drain and locked outcomes; restore tests cover persistent recovery material and collision isolation. The shared test loader preserves module identity for operation contexts. Native APIs and Back handling are mocked in these tests.</w:t>
+        <w:t xml:space="preserve"> directory or Jest script. Operation lifecycle and restore-session regression scripts now exercise cross-domain races, queue invalidation, cleanup/private-connection drain and locked outcomes; restore tests cover persistent recovery material and collision isolation. The shared test loader preserves module identity for operation contexts. Backup concurrency hardening adds 20 deterministic race/failure/isolation scenarios with real temporary SQLite snapshots and actual photo workflows, plus rendered rapid-invocation UI checks. All 21 regression scripts, TypeScript and changed-file ESLint pass for this milestone; no APK/device testing was performed. Native APIs and Back handling are mocked in these tests.</w:t>
       </w:r>
     </w:p>
     <w:p>
@@ -2945,11 +3026,11 @@
       <w:pPr>
         <w:pStyle w:val="Heading2"/>
       </w:pPr>
-      <w:bookmarkStart w:id="95" w:name="section_17"/>
+      <w:bookmarkStart w:id="99" w:name="section_18"/>
       <w:r>
         <w:t xml:space="preserve">14. Development Environment</w:t>
       </w:r>
-      <w:bookmarkEnd w:id="95"/>
+      <w:bookmarkEnd w:id="99"/>
     </w:p>
     <w:p>
       <w:pPr>
@@ -2999,11 +3080,11 @@
       <w:pPr>
         <w:pStyle w:val="Heading2"/>
       </w:pPr>
-      <w:bookmarkStart w:id="97" w:name="section_18"/>
+      <w:bookmarkStart w:id="101" w:name="section_19"/>
       <w:r>
         <w:t xml:space="preserve">15. Git Workflow</w:t>
       </w:r>
-      <w:bookmarkEnd w:id="97"/>
+      <w:bookmarkEnd w:id="101"/>
     </w:p>
     <w:p>
       <w:pPr>
@@ -3080,11 +3161,11 @@
       <w:pPr>
         <w:pStyle w:val="Heading2"/>
       </w:pPr>
-      <w:bookmarkStart w:id="99" w:name="section_19"/>
+      <w:bookmarkStart w:id="103" w:name="section_20"/>
       <w:r>
         <w:t xml:space="preserve">16. Android / EAS Build System</w:t>
       </w:r>
-      <w:bookmarkEnd w:id="99"/>
+      <w:bookmarkEnd w:id="103"/>
     </w:p>
     <w:p>
       <w:pPr>
@@ -3241,11 +3322,11 @@
       <w:pPr>
         <w:pStyle w:val="Heading2"/>
       </w:pPr>
-      <w:bookmarkStart w:id="102" w:name="section_20"/>
+      <w:bookmarkStart w:id="106" w:name="section_21"/>
       <w:r>
         <w:t xml:space="preserve">17. APK Update Safety</w:t>
       </w:r>
-      <w:bookmarkEnd w:id="102"/>
+      <w:bookmarkEnd w:id="106"/>
     </w:p>
     <w:p>
       <w:pPr>
@@ -3313,11 +3394,11 @@
       <w:pPr>
         <w:pStyle w:val="Heading2"/>
       </w:pPr>
-      <w:bookmarkStart w:id="104" w:name="section_21"/>
+      <w:bookmarkStart w:id="108" w:name="section_22"/>
       <w:r>
         <w:t xml:space="preserve">18. Known Issues</w:t>
       </w:r>
-      <w:bookmarkEnd w:id="104"/>
+      <w:bookmarkEnd w:id="108"/>
     </w:p>
     <w:tbl>
       <w:tblPr>
@@ -3613,7 +3694,7 @@
               <w:pStyle w:val="TableBody"/>
             </w:pPr>
             <w:r>
-              <w:t xml:space="preserve">Create/inspect/restore, operation drain, persistent rollback, catastrophic lock and cross-device paths are implemented with automated/mock coverage; retained recovery sets have no automatic recovery UI.</w:t>
+              <w:t xml:space="preserve">Create/inspect/restore, protected backup capture, concurrent-create rejection, operation drain, persistent rollback, catastrophic lock and cross-device paths are implemented with automated/mock coverage; retained recovery sets have no automatic recovery UI.</w:t>
             </w:r>
           </w:p>
         </w:tc>
@@ -3803,11 +3884,11 @@
       <w:pPr>
         <w:pStyle w:val="Heading2"/>
       </w:pPr>
-      <w:bookmarkStart w:id="106" w:name="section_22"/>
+      <w:bookmarkStart w:id="110" w:name="section_23"/>
       <w:r>
         <w:t xml:space="preserve">19. Future Roadmap</w:t>
       </w:r>
-      <w:bookmarkEnd w:id="106"/>
+      <w:bookmarkEnd w:id="110"/>
     </w:p>
     <w:p>
       <w:pPr>
@@ -3838,11 +3919,11 @@
       <w:pPr>
         <w:pStyle w:val="Heading2"/>
       </w:pPr>
-      <w:bookmarkStart w:id="109" w:name="section_23"/>
+      <w:bookmarkStart w:id="113" w:name="section_24"/>
       <w:r>
         <w:t xml:space="preserve">20. Important Files</w:t>
       </w:r>
-      <w:bookmarkEnd w:id="109"/>
+      <w:bookmarkEnd w:id="113"/>
     </w:p>
     <w:tbl>
       <w:tblPr>
@@ -4504,11 +4585,11 @@
       <w:pPr>
         <w:pStyle w:val="Heading2"/>
       </w:pPr>
-      <w:bookmarkStart w:id="111" w:name="section_24"/>
+      <w:bookmarkStart w:id="115" w:name="section_25"/>
       <w:r>
         <w:t xml:space="preserve">21. Important Technical Decisions</w:t>
       </w:r>
-      <w:bookmarkEnd w:id="111"/>
+      <w:bookmarkEnd w:id="115"/>
     </w:p>
     <w:p>
       <w:pPr>
@@ -5011,11 +5092,11 @@
       <w:pPr>
         <w:pStyle w:val="Heading2"/>
       </w:pPr>
-      <w:bookmarkStart w:id="114" w:name="section_25"/>
+      <w:bookmarkStart w:id="118" w:name="section_26"/>
       <w:r>
         <w:t xml:space="preserve">22. Instructions for Future LLMs</w:t>
       </w:r>
-      <w:bookmarkEnd w:id="114"/>
+      <w:bookmarkEnd w:id="118"/>
     </w:p>
     <w:p>
       <w:pPr>
@@ -5029,11 +5110,11 @@
       <w:pPr>
         <w:pStyle w:val="Heading2"/>
       </w:pPr>
-      <w:bookmarkStart w:id="116" w:name="section_26"/>
+      <w:bookmarkStart w:id="120" w:name="section_27"/>
       <w:r>
         <w:t xml:space="preserve">23. Current Project State</w:t>
       </w:r>
-      <w:bookmarkEnd w:id="116"/>
+      <w:bookmarkEnd w:id="120"/>
     </w:p>
     <w:p>
       <w:pPr>
@@ -5050,7 +5131,7 @@
         <w:t xml:space="preserve">Completed in source:</w:t>
       </w:r>
       <w:r>
-        <w:t xml:space="preserve"> UI/UX V2 across Home, Tasks, Garage/Vehicle Detail, Personal Expenses, Vehicle Reminders/Settings, Settings/About and remaining vehicle forms; vehicle CRUD/photos/services/coverage; personal transactions and analytics; tasks; appearance themes; local reminder scheduling; Expo Go notification isolation; Backup &amp; Restore V1 create/inspect/replacement/rollback UI and engines, shared mutation leases/exclusive maintenance and persistent catastrophic recovery material; Fuel / Charging Stage 1 foundation and Stage 2 dashboard/forms/history/details; Personal Budgets Stages 1 and 2 foundation/dashboard/forms; migrations through v11; and regression scripts.</w:t>
+        <w:t xml:space="preserve"> UI/UX V2 across Home, Tasks, Garage/Vehicle Detail, Personal Expenses, Vehicle Reminders/Settings, Settings/About and remaining vehicle forms; vehicle CRUD/photos/services/coverage; personal transactions and analytics; tasks; appearance themes; local reminder scheduling; Expo Go notification isolation; Backup &amp; Restore V1 create/inspect/replacement/rollback UI and engines, shared mutation leases/exclusive maintenance, protected backup snapshot capture with isolated staging/concurrency guards, and persistent catastrophic recovery material; Fuel / Charging Stage 1 foundation and Stage 2 dashboard/forms/history/details; Personal Budgets Stages 1 and 2 foundation/dashboard/forms; migrations through v11; and regression scripts.</w:t>
       </w:r>
     </w:p>
     <w:p>
@@ -5111,11 +5192,11 @@
       <w:pPr>
         <w:pStyle w:val="Heading2"/>
       </w:pPr>
-      <w:bookmarkStart w:id="121" w:name="section_27"/>
+      <w:bookmarkStart w:id="125" w:name="section_28"/>
       <w:r>
         <w:t xml:space="preserve">24. Changelog</w:t>
       </w:r>
-      <w:bookmarkEnd w:id="121"/>
+      <w:bookmarkEnd w:id="125"/>
     </w:p>
     <w:tbl>
       <w:tblPr>
@@ -5515,6 +5596,48 @@
               <w:pStyle w:val="TableBody"/>
             </w:pPr>
             <w:r>
+              <w:t xml:space="preserve">Hardened backup snapshot consistency and concurrency.</w:t>
+            </w:r>
+          </w:p>
+        </w:tc>
+        <w:tc>
+          <w:tcPr>
+            <w:tcW w:w="6410" w:type="dxa"/>
+            <w:shd w:fill="F7FAF8"/>
+          </w:tcPr>
+          <w:p>
+            <w:pPr>
+              <w:pStyle w:val="TableBody"/>
+            </w:pPr>
+            <w:r>
+              <w:t xml:space="preserve">Separate drain/capture barrier protects SQLite and owned files; immutable packaging resumes admission early. Typed busy rejection, unique validated staging, cleanup reporting and immediate UI guard; 20 new race scenarios. Schema v11, archive format and restore semantics unchanged; native verification pending.</w:t>
+            </w:r>
+          </w:p>
+        </w:tc>
+      </w:tr>
+      <w:tr>
+        <w:tc>
+          <w:tcPr>
+            <w:tcW w:w="1100" w:type="dxa"/>
+          </w:tcPr>
+          <w:p>
+            <w:pPr>
+              <w:pStyle w:val="TableBody"/>
+            </w:pPr>
+            <w:r>
+              <w:t xml:space="preserve">2026-09-29</w:t>
+            </w:r>
+          </w:p>
+        </w:tc>
+        <w:tc>
+          <w:tcPr>
+            <w:tcW w:w="1850" w:type="dxa"/>
+          </w:tcPr>
+          <w:p>
+            <w:pPr>
+              <w:pStyle w:val="TableBody"/>
+            </w:pPr>
+            <w:r>
               <w:t xml:space="preserve">Implemented Personal Budgets V1 Stage 2 UI.</w:t>
             </w:r>
           </w:p>
@@ -5522,7 +5645,6 @@
         <w:tc>
           <w:tcPr>
             <w:tcW w:w="6410" w:type="dxa"/>
-            <w:shd w:fill="F7FAF8"/>
           </w:tcPr>
           <w:p>
             <w:pPr>
@@ -5538,6 +5660,7 @@
         <w:tc>
           <w:tcPr>
             <w:tcW w:w="1100" w:type="dxa"/>
+            <w:shd w:fill="F7FAF8"/>
           </w:tcPr>
           <w:p>
             <w:pPr>
@@ -5551,6 +5674,7 @@
         <w:tc>
           <w:tcPr>
             <w:tcW w:w="1850" w:type="dxa"/>
+            <w:shd w:fill="F7FAF8"/>
           </w:tcPr>
           <w:p>
             <w:pPr>
@@ -5564,6 +5688,7 @@
         <w:tc>
           <w:tcPr>
             <w:tcW w:w="6410" w:type="dxa"/>
+            <w:shd w:fill="F7FAF8"/>
           </w:tcPr>
           <w:p>
             <w:pPr>
@@ -5579,7 +5704,6 @@
         <w:tc>
           <w:tcPr>
             <w:tcW w:w="1100" w:type="dxa"/>
-            <w:shd w:fill="F7FAF8"/>
           </w:tcPr>
           <w:p>
             <w:pPr>
@@ -5593,7 +5717,6 @@
         <w:tc>
           <w:tcPr>
             <w:tcW w:w="1850" w:type="dxa"/>
-            <w:shd w:fill="F7FAF8"/>
           </w:tcPr>
           <w:p>
             <w:pPr>
@@ -5607,7 +5730,6 @@
         <w:tc>
           <w:tcPr>
             <w:tcW w:w="6410" w:type="dxa"/>
-            <w:shd w:fill="F7FAF8"/>
           </w:tcPr>
           <w:p>
             <w:pPr>
@@ -5623,6 +5745,7 @@
         <w:tc>
           <w:tcPr>
             <w:tcW w:w="1100" w:type="dxa"/>
+            <w:shd w:fill="F7FAF8"/>
           </w:tcPr>
           <w:p>
             <w:pPr>
@@ -5636,6 +5759,7 @@
         <w:tc>
           <w:tcPr>
             <w:tcW w:w="1850" w:type="dxa"/>
+            <w:shd w:fill="F7FAF8"/>
           </w:tcPr>
           <w:p>
             <w:pPr>
@@ -5649,6 +5773,7 @@
         <w:tc>
           <w:tcPr>
             <w:tcW w:w="6410" w:type="dxa"/>
+            <w:shd w:fill="F7FAF8"/>
           </w:tcPr>
           <w:p>
             <w:pPr>
@@ -5664,7 +5789,6 @@
         <w:tc>
           <w:tcPr>
             <w:tcW w:w="1100" w:type="dxa"/>
-            <w:shd w:fill="F7FAF8"/>
           </w:tcPr>
           <w:p>
             <w:pPr>
@@ -5678,7 +5802,6 @@
         <w:tc>
           <w:tcPr>
             <w:tcW w:w="1850" w:type="dxa"/>
-            <w:shd w:fill="F7FAF8"/>
           </w:tcPr>
           <w:p>
             <w:pPr>
@@ -5692,7 +5815,6 @@
         <w:tc>
           <w:tcPr>
             <w:tcW w:w="6410" w:type="dxa"/>
-            <w:shd w:fill="F7FAF8"/>
           </w:tcPr>
           <w:p>
             <w:pPr>

</xml_diff>